<commit_message>
feat(metais-v1): [W7-E1] the terms check recorded, and EN 301 549 V4.1.1 in the project's own words
</commit_message>
<xml_diff>
--- a/examples/accessibility-conformance-report/examples/international/expected/acr.docx
+++ b/examples/accessibility-conformance-report/examples/international/expected/acr.docx
@@ -182,7 +182,7 @@
     </w:p>
     <w:p>
       <w:r>
-        <w:t xml:space="preserve">EN 301 549 V3.2.1 (2021-03), Accessibility requirements for ICT products and services.</w:t>
+        <w:t xml:space="preserve">EN 301 549 V4.1.1 (2026-09), Accessibility requirements for ICT products and services.</w:t>
       </w:r>
     </w:p>
     <w:p>
@@ -5876,7 +5876,7 @@
           </w:tcPr>
           <w:p>
             <w:r>
-              <w:t xml:space="preserve">4.2.1 Use without vision</w:t>
+              <w:t xml:space="preserve">4.2.1 Operating the product without sight</w:t>
             </w:r>
           </w:p>
         </w:tc>
@@ -5911,7 +5911,7 @@
           </w:tcPr>
           <w:p>
             <w:r>
-              <w:t xml:space="preserve">4.2.2 Use with limited vision</w:t>
+              <w:t xml:space="preserve">4.2.2 Operating the product with low vision</w:t>
             </w:r>
           </w:p>
         </w:tc>
@@ -5946,7 +5946,7 @@
           </w:tcPr>
           <w:p>
             <w:r>
-              <w:t xml:space="preserve">4.2.3 Use without perceiving colour</w:t>
+              <w:t xml:space="preserve">4.2.3 Operating the product without telling colours apart</w:t>
             </w:r>
           </w:p>
         </w:tc>
@@ -5981,7 +5981,7 @@
           </w:tcPr>
           <w:p>
             <w:r>
-              <w:t xml:space="preserve">4.2.4 Use without hearing</w:t>
+              <w:t xml:space="preserve">4.2.4 Operating the product without sound</w:t>
             </w:r>
           </w:p>
         </w:tc>
@@ -6016,7 +6016,7 @@
           </w:tcPr>
           <w:p>
             <w:r>
-              <w:t xml:space="preserve">4.2.5 Use with limited hearing</w:t>
+              <w:t xml:space="preserve">4.2.5 Operating the product with reduced hearing</w:t>
             </w:r>
           </w:p>
         </w:tc>
@@ -6051,7 +6051,7 @@
           </w:tcPr>
           <w:p>
             <w:r>
-              <w:t xml:space="preserve">4.2.6 Use without speech, or with limited speech</w:t>
+              <w:t xml:space="preserve">4.2.6 Operating the product without speaking</w:t>
             </w:r>
           </w:p>
         </w:tc>
@@ -6086,7 +6086,7 @@
           </w:tcPr>
           <w:p>
             <w:r>
-              <w:t xml:space="preserve">4.2.7 Use with limited manipulation or strength</w:t>
+              <w:t xml:space="preserve">4.2.7 Operating the product with limited dexterity or strength</w:t>
             </w:r>
           </w:p>
         </w:tc>
@@ -6121,7 +6121,7 @@
           </w:tcPr>
           <w:p>
             <w:r>
-              <w:t xml:space="preserve">4.2.8 Use with limited reach</w:t>
+              <w:t xml:space="preserve">4.2.8 Operating the product from a limited reach</w:t>
             </w:r>
           </w:p>
         </w:tc>
@@ -6156,7 +6156,7 @@
           </w:tcPr>
           <w:p>
             <w:r>
-              <w:t xml:space="preserve">4.2.9 Reducing triggers of photosensitive seizures</w:t>
+              <w:t xml:space="preserve">4.2.9 Keeping flashing below seizure risk</w:t>
             </w:r>
           </w:p>
         </w:tc>
@@ -6191,7 +6191,7 @@
           </w:tcPr>
           <w:p>
             <w:r>
-              <w:t xml:space="preserve">4.2.10 Use with limited cognition, language or learning</w:t>
+              <w:t xml:space="preserve">4.2.10 Operating the product with cognitive or learning disabilities, or little command of its language</w:t>
             </w:r>
           </w:p>
         </w:tc>
@@ -6226,7 +6226,7 @@
           </w:tcPr>
           <w:p>
             <w:r>
-              <w:t xml:space="preserve">4.2.11 Privacy of users of accessibility features</w:t>
+              <w:t xml:space="preserve">4.2.11 The same privacy for users of accessibility features</w:t>
             </w:r>
           </w:p>
         </w:tc>
@@ -6261,7 +6261,7 @@
           </w:tcPr>
           <w:p>
             <w:r>
-              <w:t xml:space="preserve">5.1.2.1 Closed functionality: general</w:t>
+              <w:t xml:space="preserve">5.1.2.1 Closed products meet the closed-product clauses</w:t>
             </w:r>
           </w:p>
         </w:tc>
@@ -6296,7 +6296,7 @@
           </w:tcPr>
           <w:p>
             <w:r>
-              <w:t xml:space="preserve">5.1.2.2 Closed functionality: no reliance on assistive technology</w:t>
+              <w:t xml:space="preserve">5.1.2.2 Closed products need no added assistive technology</w:t>
             </w:r>
           </w:p>
         </w:tc>
@@ -6331,7 +6331,7 @@
           </w:tcPr>
           <w:p>
             <w:r>
-              <w:t xml:space="preserve">5.1.3.1 Non-visual access: general</w:t>
+              <w:t xml:space="preserve">5.1.3.1 Closed products: what is shown is also spoken</w:t>
             </w:r>
           </w:p>
         </w:tc>
@@ -6366,7 +6366,7 @@
           </w:tcPr>
           <w:p>
             <w:r>
-              <w:t xml:space="preserve">5.1.3.2 Non-visual access: delivering speech</w:t>
+              <w:t xml:space="preserve">5.1.3.2 Closed products: how speech reaches the user</w:t>
             </w:r>
           </w:p>
         </w:tc>
@@ -6401,7 +6401,7 @@
           </w:tcPr>
           <w:p>
             <w:r>
-              <w:t xml:space="preserve">5.1.3.3 Non-visual access: keeping speech in step</w:t>
+              <w:t xml:space="preserve">5.1.3.3 Closed products: speech matches the screen</w:t>
             </w:r>
           </w:p>
         </w:tc>
@@ -6436,7 +6436,7 @@
           </w:tcPr>
           <w:p>
             <w:r>
-              <w:t xml:space="preserve">5.1.3.4 Non-visual access: control of speech</w:t>
+              <w:t xml:space="preserve">5.1.3.4 Closed products: pausing and repeating speech</w:t>
             </w:r>
           </w:p>
         </w:tc>
@@ -6471,7 +6471,7 @@
           </w:tcPr>
           <w:p>
             <w:r>
-              <w:t xml:space="preserve">5.1.3.5 Non-visual access: interrupting speech</w:t>
+              <w:t xml:space="preserve">5.1.3.5 Closed products: speech gives way to the user</w:t>
             </w:r>
           </w:p>
         </w:tc>
@@ -6506,7 +6506,7 @@
           </w:tcPr>
           <w:p>
             <w:r>
-              <w:t xml:space="preserve">5.1.3.6 Non-visual access: speaking non-text content</w:t>
+              <w:t xml:space="preserve">5.1.3.6 Closed products: speaking images and other non-text content</w:t>
             </w:r>
           </w:p>
         </w:tc>
@@ -6541,7 +6541,7 @@
           </w:tcPr>
           <w:p>
             <w:r>
-              <w:t xml:space="preserve">5.1.3.7 Non-visual access: speaking video information</w:t>
+              <w:t xml:space="preserve">5.1.3.7 Closed products: speaking what video shows</w:t>
             </w:r>
           </w:p>
         </w:tc>
@@ -6576,7 +6576,7 @@
           </w:tcPr>
           <w:p>
             <w:r>
-              <w:t xml:space="preserve">5.1.3.8 Non-visual access: masked entry</w:t>
+              <w:t xml:space="preserve">5.1.3.8 Closed products: hidden characters stay hidden</w:t>
             </w:r>
           </w:p>
         </w:tc>
@@ -6611,7 +6611,7 @@
           </w:tcPr>
           <w:p>
             <w:r>
-              <w:t xml:space="preserve">5.1.3.9 Non-visual access: private personal data</w:t>
+              <w:t xml:space="preserve">5.1.3.9 Closed products: personal data spoken privately</w:t>
             </w:r>
           </w:p>
         </w:tc>
@@ -6646,7 +6646,7 @@
           </w:tcPr>
           <w:p>
             <w:r>
-              <w:t xml:space="preserve">5.1.3.10 Non-visual access: audio that does not interfere</w:t>
+              <w:t xml:space="preserve">5.1.3.10 Closed products: other sounds do not drown out speech</w:t>
             </w:r>
           </w:p>
         </w:tc>
@@ -6681,7 +6681,7 @@
           </w:tcPr>
           <w:p>
             <w:r>
-              <w:t xml:space="preserve">5.1.3.11 Non-visual access: private listening volume</w:t>
+              <w:t xml:space="preserve">5.1.3.11 Closed products: volume for private listening</w:t>
             </w:r>
           </w:p>
         </w:tc>
@@ -6716,7 +6716,7 @@
           </w:tcPr>
           <w:p>
             <w:r>
-              <w:t xml:space="preserve">5.1.3.12 Non-visual access: speaker volume</w:t>
+              <w:t xml:space="preserve">5.1.3.12 Closed products: loudspeaker volume</w:t>
             </w:r>
           </w:p>
         </w:tc>
@@ -6751,7 +6751,7 @@
           </w:tcPr>
           <w:p>
             <w:r>
-              <w:t xml:space="preserve">5.1.3.13 Non-visual access: resetting volume</w:t>
+              <w:t xml:space="preserve">5.1.3.13 Closed products: volume back to normal between users</w:t>
             </w:r>
           </w:p>
         </w:tc>
@@ -6786,7 +6786,7 @@
           </w:tcPr>
           <w:p>
             <w:r>
-              <w:t xml:space="preserve">5.1.3.14 Non-visual access: spoken languages</w:t>
+              <w:t xml:space="preserve">5.1.3.14 Closed products: speech in the content's language</w:t>
             </w:r>
           </w:p>
         </w:tc>
@@ -6821,7 +6821,7 @@
           </w:tcPr>
           <w:p>
             <w:r>
-              <w:t xml:space="preserve">5.1.3.15 Non-visual access: identifying errors</w:t>
+              <w:t xml:space="preserve">5.1.3.15 Closed products: errors announced in speech</w:t>
             </w:r>
           </w:p>
         </w:tc>
@@ -6856,7 +6856,7 @@
           </w:tcPr>
           <w:p>
             <w:r>
-              <w:t xml:space="preserve">5.1.3.16 Non-visual access: receipts and tickets</w:t>
+              <w:t xml:space="preserve">5.1.3.16 Closed products: receipts and tickets in speech</w:t>
             </w:r>
           </w:p>
         </w:tc>
@@ -6891,7 +6891,7 @@
           </w:tcPr>
           <w:p>
             <w:r>
-              <w:t xml:space="preserve">5.1.4 Closed functionality: enlarging text</w:t>
+              <w:t xml:space="preserve">5.1.4 Closed products: text large enough without enlargement</w:t>
             </w:r>
           </w:p>
         </w:tc>
@@ -6926,7 +6926,7 @@
           </w:tcPr>
           <w:p>
             <w:r>
-              <w:t xml:space="preserve">5.1.5 Closed functionality: seeing auditory information</w:t>
+              <w:t xml:space="preserve">5.1.5 Closed products: sound information also shown</w:t>
             </w:r>
           </w:p>
         </w:tc>
@@ -6961,7 +6961,7 @@
           </w:tcPr>
           <w:p>
             <w:r>
-              <w:t xml:space="preserve">5.1.6.1 Closed functionality: operating without a keyboard</w:t>
+              <w:t xml:space="preserve">5.1.6.1 Closed products: use without a keyboard</w:t>
             </w:r>
           </w:p>
         </w:tc>
@@ -6996,7 +6996,7 @@
           </w:tcPr>
           <w:p>
             <w:r>
-              <w:t xml:space="preserve">5.1.6.2 Closed functionality: input focus</w:t>
+              <w:t xml:space="preserve">5.1.6.2 Closed products: focus never trapped</w:t>
             </w:r>
           </w:p>
         </w:tc>
@@ -7031,7 +7031,7 @@
           </w:tcPr>
           <w:p>
             <w:r>
-              <w:t xml:space="preserve">5.1.7 Closed functionality: access without speech</w:t>
+              <w:t xml:space="preserve">5.1.7 Closed products: another way than speaking</w:t>
             </w:r>
           </w:p>
         </w:tc>
@@ -7066,7 +7066,42 @@
           </w:tcPr>
           <w:p>
             <w:r>
-              <w:t xml:space="preserve">5.2 Turning on accessibility features</w:t>
+              <w:t xml:space="preserve">5.1.8 Closed products: the purpose of personal fields spoken</w:t>
+            </w:r>
+          </w:p>
+        </w:tc>
+        <w:tc>
+          <w:tcPr>
+            <w:tcW w:w="1800" w:type="dxa"/>
+          </w:tcPr>
+          <w:p>
+            <w:r>
+              <w:t>Not Applicable</w:t>
+            </w:r>
+          </w:p>
+        </w:tc>
+        <w:tc>
+          <w:tcPr>
+            <w:tcW w:w="4560" w:type="dxa"/>
+          </w:tcPr>
+          <w:p>
+            <w:r>
+              <w:t xml:space="preserve">The product has no closed functionality: it runs in the user's own browser, with the user's own assistive technology.</w:t>
+            </w:r>
+          </w:p>
+        </w:tc>
+      </w:tr>
+      <w:tr>
+        <w:trPr>
+          <w:cantSplit/>
+        </w:trPr>
+        <w:tc>
+          <w:tcPr>
+            <w:tcW w:w="3000" w:type="dxa"/>
+          </w:tcPr>
+          <w:p>
+            <w:r>
+              <w:t xml:space="preserve">5.2 Turning on accessibility features without them</w:t>
             </w:r>
           </w:p>
         </w:tc>
@@ -7101,7 +7136,7 @@
           </w:tcPr>
           <w:p>
             <w:r>
-              <w:t xml:space="preserve">5.3 Biometrics</w:t>
+              <w:t xml:space="preserve">5.3 Identifying users by the body</w:t>
             </w:r>
           </w:p>
         </w:tc>
@@ -7136,7 +7171,7 @@
           </w:tcPr>
           <w:p>
             <w:r>
-              <w:t xml:space="preserve">5.4 Keeping accessibility information through conversion</w:t>
+              <w:t xml:space="preserve">5.4 Accessibility information survives conversion</w:t>
             </w:r>
           </w:p>
         </w:tc>
@@ -7171,7 +7206,7 @@
           </w:tcPr>
           <w:p>
             <w:r>
-              <w:t xml:space="preserve">5.5.1 Operable parts: how they are operated</w:t>
+              <w:t xml:space="preserve">5.5 Controls that can be found and used by touch</w:t>
             </w:r>
           </w:p>
         </w:tc>
@@ -7206,7 +7241,7 @@
           </w:tcPr>
           <w:p>
             <w:r>
-              <w:t xml:space="preserve">5.5.2 Operable parts: telling them apart</w:t>
+              <w:t xml:space="preserve">5.6.1 Locking and toggle controls: state by touch or sound</w:t>
             </w:r>
           </w:p>
         </w:tc>
@@ -7241,7 +7276,7 @@
           </w:tcPr>
           <w:p>
             <w:r>
-              <w:t xml:space="preserve">5.6.1 Locking and toggle controls: status by touch or sound</w:t>
+              <w:t xml:space="preserve">5.6.2 Locking and toggle controls: state by sight</w:t>
             </w:r>
           </w:p>
         </w:tc>
@@ -7276,42 +7311,7 @@
           </w:tcPr>
           <w:p>
             <w:r>
-              <w:t xml:space="preserve">5.6.2 Locking and toggle controls: status by sight</w:t>
-            </w:r>
-          </w:p>
-        </w:tc>
-        <w:tc>
-          <w:tcPr>
-            <w:tcW w:w="1800" w:type="dxa"/>
-          </w:tcPr>
-          <w:p>
-            <w:r>
-              <w:t>Not Applicable</w:t>
-            </w:r>
-          </w:p>
-        </w:tc>
-        <w:tc>
-          <w:tcPr>
-            <w:tcW w:w="4560" w:type="dxa"/>
-          </w:tcPr>
-          <w:p>
-            <w:r>
-              <w:t xml:space="preserve">The product has no closed functionality: it runs in the user's own browser, with the user's own assistive technology.</w:t>
-            </w:r>
-          </w:p>
-        </w:tc>
-      </w:tr>
-      <w:tr>
-        <w:trPr>
-          <w:cantSplit/>
-        </w:trPr>
-        <w:tc>
-          <w:tcPr>
-            <w:tcW w:w="3000" w:type="dxa"/>
-          </w:tcPr>
-          <w:p>
-            <w:r>
-              <w:t xml:space="preserve">5.7 Key repeat</w:t>
+              <w:t xml:space="preserve">5.7 Repeating keys adjustable</w:t>
             </w:r>
           </w:p>
         </w:tc>
@@ -7346,7 +7346,7 @@
           </w:tcPr>
           <w:p>
             <w:r>
-              <w:t xml:space="preserve">5.8 Accepting a double strike</w:t>
+              <w:t xml:space="preserve">5.8 Accepting a doubled keystroke</w:t>
             </w:r>
           </w:p>
         </w:tc>
@@ -7381,7 +7381,7 @@
           </w:tcPr>
           <w:p>
             <w:r>
-              <w:t xml:space="preserve">5.9 Simultaneous user actions</w:t>
+              <w:t xml:space="preserve">5.9 No need to act in two places at once</w:t>
             </w:r>
           </w:p>
         </w:tc>
@@ -7416,7 +7416,182 @@
           </w:tcPr>
           <w:p>
             <w:r>
-              <w:t xml:space="preserve">6.1 Audio bandwidth for speech</w:t>
+              <w:t xml:space="preserve">5.10.1 Authoring tools: formats that support accessibility</w:t>
+            </w:r>
+          </w:p>
+        </w:tc>
+        <w:tc>
+          <w:tcPr>
+            <w:tcW w:w="1800" w:type="dxa"/>
+          </w:tcPr>
+          <w:p>
+            <w:r>
+              <w:t>Not Applicable</w:t>
+            </w:r>
+          </w:p>
+        </w:tc>
+        <w:tc>
+          <w:tcPr>
+            <w:tcW w:w="4560" w:type="dxa"/>
+          </w:tcPr>
+          <w:p>
+            <w:r>
+              <w:t xml:space="preserve">The product is not an authoring tool.</w:t>
+            </w:r>
+          </w:p>
+        </w:tc>
+      </w:tr>
+      <w:tr>
+        <w:trPr>
+          <w:cantSplit/>
+        </w:trPr>
+        <w:tc>
+          <w:tcPr>
+            <w:tcW w:w="3000" w:type="dxa"/>
+          </w:tcPr>
+          <w:p>
+            <w:r>
+              <w:t xml:space="preserve">5.10.2 Authoring tools: making accessible content</w:t>
+            </w:r>
+          </w:p>
+        </w:tc>
+        <w:tc>
+          <w:tcPr>
+            <w:tcW w:w="1800" w:type="dxa"/>
+          </w:tcPr>
+          <w:p>
+            <w:r>
+              <w:t>Not Applicable</w:t>
+            </w:r>
+          </w:p>
+        </w:tc>
+        <w:tc>
+          <w:tcPr>
+            <w:tcW w:w="4560" w:type="dxa"/>
+          </w:tcPr>
+          <w:p>
+            <w:r>
+              <w:t xml:space="preserve">The product is not an authoring tool.</w:t>
+            </w:r>
+          </w:p>
+        </w:tc>
+      </w:tr>
+      <w:tr>
+        <w:trPr>
+          <w:cantSplit/>
+        </w:trPr>
+        <w:tc>
+          <w:tcPr>
+            <w:tcW w:w="3000" w:type="dxa"/>
+          </w:tcPr>
+          <w:p>
+            <w:r>
+              <w:t xml:space="preserve">5.10.3 Authoring tools: accessibility kept through transformation</w:t>
+            </w:r>
+          </w:p>
+        </w:tc>
+        <w:tc>
+          <w:tcPr>
+            <w:tcW w:w="1800" w:type="dxa"/>
+          </w:tcPr>
+          <w:p>
+            <w:r>
+              <w:t>Not Applicable</w:t>
+            </w:r>
+          </w:p>
+        </w:tc>
+        <w:tc>
+          <w:tcPr>
+            <w:tcW w:w="4560" w:type="dxa"/>
+          </w:tcPr>
+          <w:p>
+            <w:r>
+              <w:t xml:space="preserve">The product is not an authoring tool.</w:t>
+            </w:r>
+          </w:p>
+        </w:tc>
+      </w:tr>
+      <w:tr>
+        <w:trPr>
+          <w:cantSplit/>
+        </w:trPr>
+        <w:tc>
+          <w:tcPr>
+            <w:tcW w:w="3000" w:type="dxa"/>
+          </w:tcPr>
+          <w:p>
+            <w:r>
+              <w:t xml:space="preserve">5.10.4 Authoring tools: help fixing problems</w:t>
+            </w:r>
+          </w:p>
+        </w:tc>
+        <w:tc>
+          <w:tcPr>
+            <w:tcW w:w="1800" w:type="dxa"/>
+          </w:tcPr>
+          <w:p>
+            <w:r>
+              <w:t>Not Applicable</w:t>
+            </w:r>
+          </w:p>
+        </w:tc>
+        <w:tc>
+          <w:tcPr>
+            <w:tcW w:w="4560" w:type="dxa"/>
+          </w:tcPr>
+          <w:p>
+            <w:r>
+              <w:t xml:space="preserve">The product is not an authoring tool.</w:t>
+            </w:r>
+          </w:p>
+        </w:tc>
+      </w:tr>
+      <w:tr>
+        <w:trPr>
+          <w:cantSplit/>
+        </w:trPr>
+        <w:tc>
+          <w:tcPr>
+            <w:tcW w:w="3000" w:type="dxa"/>
+          </w:tcPr>
+          <w:p>
+            <w:r>
+              <w:t xml:space="preserve">5.10.5 Authoring tools: accessible starting points</w:t>
+            </w:r>
+          </w:p>
+        </w:tc>
+        <w:tc>
+          <w:tcPr>
+            <w:tcW w:w="1800" w:type="dxa"/>
+          </w:tcPr>
+          <w:p>
+            <w:r>
+              <w:t>Not Applicable</w:t>
+            </w:r>
+          </w:p>
+        </w:tc>
+        <w:tc>
+          <w:tcPr>
+            <w:tcW w:w="4560" w:type="dxa"/>
+          </w:tcPr>
+          <w:p>
+            <w:r>
+              <w:t xml:space="preserve">The product is not an authoring tool.</w:t>
+            </w:r>
+          </w:p>
+        </w:tc>
+      </w:tr>
+      <w:tr>
+        <w:trPr>
+          <w:cantSplit/>
+        </w:trPr>
+        <w:tc>
+          <w:tcPr>
+            <w:tcW w:w="3000" w:type="dxa"/>
+          </w:tcPr>
+          <w:p>
+            <w:r>
+              <w:t xml:space="preserve">6.1.1 Voice calls: interoperability documented</w:t>
             </w:r>
           </w:p>
         </w:tc>
@@ -7451,7 +7626,7 @@
           </w:tcPr>
           <w:p>
             <w:r>
-              <w:t xml:space="preserve">6.2.1.1 Real-time text: communicating in text</w:t>
+              <w:t xml:space="preserve">6.1.2 Voice calls: frequency range</w:t>
             </w:r>
           </w:p>
         </w:tc>
@@ -7486,7 +7661,7 @@
           </w:tcPr>
           <w:p>
             <w:r>
-              <w:t xml:space="preserve">6.2.1.2 Real-time text: voice and text at once</w:t>
+              <w:t xml:space="preserve">6.1.3 Voice calls: frequency range for attached headsets</w:t>
             </w:r>
           </w:p>
         </w:tc>
@@ -7521,7 +7696,7 @@
           </w:tcPr>
           <w:p>
             <w:r>
-              <w:t xml:space="preserve">6.2.2.1 Real-time text: telling text apart</w:t>
+              <w:t xml:space="preserve">6.1.4 Voice calls: subtitles in step</w:t>
             </w:r>
           </w:p>
         </w:tc>
@@ -7556,7 +7731,7 @@
           </w:tcPr>
           <w:p>
             <w:r>
-              <w:t xml:space="preserve">6.2.2.2 Real-time text: direction known to software</w:t>
+              <w:t xml:space="preserve">6.2.1.1 Real-time text: offered beside voice</w:t>
             </w:r>
           </w:p>
         </w:tc>
@@ -7591,7 +7766,7 @@
           </w:tcPr>
           <w:p>
             <w:r>
-              <w:t xml:space="preserve">6.2.2.3 Real-time text: identifying the speaker</w:t>
+              <w:t xml:space="preserve">6.2.1.2 Real-time text: voice and text together</w:t>
             </w:r>
           </w:p>
         </w:tc>
@@ -7626,7 +7801,7 @@
           </w:tcPr>
           <w:p>
             <w:r>
-              <w:t xml:space="preserve">6.2.2.4 Real-time text: visual indicator of audio</w:t>
+              <w:t xml:space="preserve">6.2.1.3 Real-time text: one action for every medium</w:t>
             </w:r>
           </w:p>
         </w:tc>
@@ -7661,7 +7836,7 @@
           </w:tcPr>
           <w:p>
             <w:r>
-              <w:t xml:space="preserve">6.2.3 Real-time text: interoperability</w:t>
+              <w:t xml:space="preserve">6.2.2.1 Real-time text: telling sent from received</w:t>
             </w:r>
           </w:p>
         </w:tc>
@@ -7696,7 +7871,7 @@
           </w:tcPr>
           <w:p>
             <w:r>
-              <w:t xml:space="preserve">6.2.4 Real-time text: responsiveness</w:t>
+              <w:t xml:space="preserve">6.2.2.2 Real-time text: showing who is communicating</w:t>
             </w:r>
           </w:p>
         </w:tc>
@@ -7731,7 +7906,7 @@
           </w:tcPr>
           <w:p>
             <w:r>
-              <w:t xml:space="preserve">6.3 Caller identification</w:t>
+              <w:t xml:space="preserve">6.2.2.3 Real-time text: showing when there is sound</w:t>
             </w:r>
           </w:p>
         </w:tc>
@@ -7766,7 +7941,7 @@
           </w:tcPr>
           <w:p>
             <w:r>
-              <w:t xml:space="preserve">6.4 Alternatives to voice-based services</w:t>
+              <w:t xml:space="preserve">6.2.2.4 Real-time text: blocks in the order written</w:t>
             </w:r>
           </w:p>
         </w:tc>
@@ -7801,7 +7976,7 @@
           </w:tcPr>
           <w:p>
             <w:r>
-              <w:t xml:space="preserve">6.5.1 Video communication: general</w:t>
+              <w:t xml:space="preserve">6.2.2.5 Real-time text: reading back the conversation</w:t>
             </w:r>
           </w:p>
         </w:tc>
@@ -7836,7 +8011,7 @@
           </w:tcPr>
           <w:p>
             <w:r>
-              <w:t xml:space="preserve">6.5.2 Video communication: resolution</w:t>
+              <w:t xml:space="preserve">6.2.3 Real-time text: touch-tones kept apart from text</w:t>
             </w:r>
           </w:p>
         </w:tc>
@@ -7871,7 +8046,7 @@
           </w:tcPr>
           <w:p>
             <w:r>
-              <w:t xml:space="preserve">6.5.3 Video communication: frame rate</w:t>
+              <w:t xml:space="preserve">6.2.4 Real-time text: sent without delay</w:t>
             </w:r>
           </w:p>
         </w:tc>
@@ -7906,7 +8081,7 @@
           </w:tcPr>
           <w:p>
             <w:r>
-              <w:t xml:space="preserve">6.5.4 Video communication: audio and video in step</w:t>
+              <w:t xml:space="preserve">6.2.5 Real-time text: typing and deleting</w:t>
             </w:r>
           </w:p>
         </w:tc>
@@ -7941,7 +8116,7 @@
           </w:tcPr>
           <w:p>
             <w:r>
-              <w:t xml:space="preserve">6.5.5 Video communication: visual indicator of audio</w:t>
+              <w:t xml:space="preserve">6.2.6 Real-time text: keeping up with several parties</w:t>
             </w:r>
           </w:p>
         </w:tc>
@@ -7976,7 +8151,7 @@
           </w:tcPr>
           <w:p>
             <w:r>
-              <w:t xml:space="preserve">6.5.6 Video communication: identifying who signs</w:t>
+              <w:t xml:space="preserve">6.2.7 Real-time text: the characters it handles</w:t>
             </w:r>
           </w:p>
         </w:tc>
@@ -8011,7 +8186,7 @@
           </w:tcPr>
           <w:p>
             <w:r>
-              <w:t xml:space="preserve">6.6 Alternatives to video-based services</w:t>
+              <w:t xml:space="preserve">6.2.8 Real-time text: every way of typing</w:t>
             </w:r>
           </w:p>
         </w:tc>
@@ -8046,7 +8221,427 @@
           </w:tcPr>
           <w:p>
             <w:r>
-              <w:t xml:space="preserve">7.1.1 Captions: playing them</w:t>
+              <w:t xml:space="preserve">6.2.9 Real-time text: always available in a call</w:t>
+            </w:r>
+          </w:p>
+        </w:tc>
+        <w:tc>
+          <w:tcPr>
+            <w:tcW w:w="1800" w:type="dxa"/>
+          </w:tcPr>
+          <w:p>
+            <w:r>
+              <w:t>Not Applicable</w:t>
+            </w:r>
+          </w:p>
+        </w:tc>
+        <w:tc>
+          <w:tcPr>
+            <w:tcW w:w="4560" w:type="dxa"/>
+          </w:tcPr>
+          <w:p>
+            <w:r>
+              <w:t xml:space="preserve">The product offers no two-way voice or video communication.</w:t>
+            </w:r>
+          </w:p>
+        </w:tc>
+      </w:tr>
+      <w:tr>
+        <w:trPr>
+          <w:cantSplit/>
+        </w:trPr>
+        <w:tc>
+          <w:tcPr>
+            <w:tcW w:w="3000" w:type="dxa"/>
+          </w:tcPr>
+          <w:p>
+            <w:r>
+              <w:t xml:space="preserve">6.2.10 Real-time text: interoperability documented</w:t>
+            </w:r>
+          </w:p>
+        </w:tc>
+        <w:tc>
+          <w:tcPr>
+            <w:tcW w:w="1800" w:type="dxa"/>
+          </w:tcPr>
+          <w:p>
+            <w:r>
+              <w:t>Not Applicable</w:t>
+            </w:r>
+          </w:p>
+        </w:tc>
+        <w:tc>
+          <w:tcPr>
+            <w:tcW w:w="4560" w:type="dxa"/>
+          </w:tcPr>
+          <w:p>
+            <w:r>
+              <w:t xml:space="preserve">The product offers no two-way voice or video communication.</w:t>
+            </w:r>
+          </w:p>
+        </w:tc>
+      </w:tr>
+      <w:tr>
+        <w:trPr>
+          <w:cantSplit/>
+        </w:trPr>
+        <w:tc>
+          <w:tcPr>
+            <w:tcW w:w="3000" w:type="dxa"/>
+          </w:tcPr>
+          <w:p>
+            <w:r>
+              <w:t xml:space="preserve">6.3 Caller identification in text</w:t>
+            </w:r>
+          </w:p>
+        </w:tc>
+        <w:tc>
+          <w:tcPr>
+            <w:tcW w:w="1800" w:type="dxa"/>
+          </w:tcPr>
+          <w:p>
+            <w:r>
+              <w:t>Not Applicable</w:t>
+            </w:r>
+          </w:p>
+        </w:tc>
+        <w:tc>
+          <w:tcPr>
+            <w:tcW w:w="4560" w:type="dxa"/>
+          </w:tcPr>
+          <w:p>
+            <w:r>
+              <w:t xml:space="preserve">The product offers no two-way voice or video communication.</w:t>
+            </w:r>
+          </w:p>
+        </w:tc>
+      </w:tr>
+      <w:tr>
+        <w:trPr>
+          <w:cantSplit/>
+        </w:trPr>
+        <w:tc>
+          <w:tcPr>
+            <w:tcW w:w="3000" w:type="dxa"/>
+          </w:tcPr>
+          <w:p>
+            <w:r>
+              <w:t xml:space="preserve">6.4 Voice services: an alternative to voice</w:t>
+            </w:r>
+          </w:p>
+        </w:tc>
+        <w:tc>
+          <w:tcPr>
+            <w:tcW w:w="1800" w:type="dxa"/>
+          </w:tcPr>
+          <w:p>
+            <w:r>
+              <w:t>Not Applicable</w:t>
+            </w:r>
+          </w:p>
+        </w:tc>
+        <w:tc>
+          <w:tcPr>
+            <w:tcW w:w="4560" w:type="dxa"/>
+          </w:tcPr>
+          <w:p>
+            <w:r>
+              <w:t xml:space="preserve">The product offers no two-way voice or video communication.</w:t>
+            </w:r>
+          </w:p>
+        </w:tc>
+      </w:tr>
+      <w:tr>
+        <w:trPr>
+          <w:cantSplit/>
+        </w:trPr>
+        <w:tc>
+          <w:tcPr>
+            <w:tcW w:w="3000" w:type="dxa"/>
+          </w:tcPr>
+          <w:p>
+            <w:r>
+              <w:t xml:space="preserve">6.5.2 Video calls: picture resolution</w:t>
+            </w:r>
+          </w:p>
+        </w:tc>
+        <w:tc>
+          <w:tcPr>
+            <w:tcW w:w="1800" w:type="dxa"/>
+          </w:tcPr>
+          <w:p>
+            <w:r>
+              <w:t>Not Applicable</w:t>
+            </w:r>
+          </w:p>
+        </w:tc>
+        <w:tc>
+          <w:tcPr>
+            <w:tcW w:w="4560" w:type="dxa"/>
+          </w:tcPr>
+          <w:p>
+            <w:r>
+              <w:t xml:space="preserve">The product offers no two-way voice or video communication.</w:t>
+            </w:r>
+          </w:p>
+        </w:tc>
+      </w:tr>
+      <w:tr>
+        <w:trPr>
+          <w:cantSplit/>
+        </w:trPr>
+        <w:tc>
+          <w:tcPr>
+            <w:tcW w:w="3000" w:type="dxa"/>
+          </w:tcPr>
+          <w:p>
+            <w:r>
+              <w:t xml:space="preserve">6.5.3 Video calls: frames per second</w:t>
+            </w:r>
+          </w:p>
+        </w:tc>
+        <w:tc>
+          <w:tcPr>
+            <w:tcW w:w="1800" w:type="dxa"/>
+          </w:tcPr>
+          <w:p>
+            <w:r>
+              <w:t>Not Applicable</w:t>
+            </w:r>
+          </w:p>
+        </w:tc>
+        <w:tc>
+          <w:tcPr>
+            <w:tcW w:w="4560" w:type="dxa"/>
+          </w:tcPr>
+          <w:p>
+            <w:r>
+              <w:t xml:space="preserve">The product offers no two-way voice or video communication.</w:t>
+            </w:r>
+          </w:p>
+        </w:tc>
+      </w:tr>
+      <w:tr>
+        <w:trPr>
+          <w:cantSplit/>
+        </w:trPr>
+        <w:tc>
+          <w:tcPr>
+            <w:tcW w:w="3000" w:type="dxa"/>
+          </w:tcPr>
+          <w:p>
+            <w:r>
+              <w:t xml:space="preserve">6.5.4 Video calls: sound and picture in step</w:t>
+            </w:r>
+          </w:p>
+        </w:tc>
+        <w:tc>
+          <w:tcPr>
+            <w:tcW w:w="1800" w:type="dxa"/>
+          </w:tcPr>
+          <w:p>
+            <w:r>
+              <w:t>Not Applicable</w:t>
+            </w:r>
+          </w:p>
+        </w:tc>
+        <w:tc>
+          <w:tcPr>
+            <w:tcW w:w="4560" w:type="dxa"/>
+          </w:tcPr>
+          <w:p>
+            <w:r>
+              <w:t xml:space="preserve">The product offers no two-way voice or video communication.</w:t>
+            </w:r>
+          </w:p>
+        </w:tc>
+      </w:tr>
+      <w:tr>
+        <w:trPr>
+          <w:cantSplit/>
+        </w:trPr>
+        <w:tc>
+          <w:tcPr>
+            <w:tcW w:w="3000" w:type="dxa"/>
+          </w:tcPr>
+          <w:p>
+            <w:r>
+              <w:t xml:space="preserve">6.5.5 Video calls: showing when there is sound</w:t>
+            </w:r>
+          </w:p>
+        </w:tc>
+        <w:tc>
+          <w:tcPr>
+            <w:tcW w:w="1800" w:type="dxa"/>
+          </w:tcPr>
+          <w:p>
+            <w:r>
+              <w:t>Not Applicable</w:t>
+            </w:r>
+          </w:p>
+        </w:tc>
+        <w:tc>
+          <w:tcPr>
+            <w:tcW w:w="4560" w:type="dxa"/>
+          </w:tcPr>
+          <w:p>
+            <w:r>
+              <w:t xml:space="preserve">The product offers no two-way voice or video communication.</w:t>
+            </w:r>
+          </w:p>
+        </w:tc>
+      </w:tr>
+      <w:tr>
+        <w:trPr>
+          <w:cantSplit/>
+        </w:trPr>
+        <w:tc>
+          <w:tcPr>
+            <w:tcW w:w="3000" w:type="dxa"/>
+          </w:tcPr>
+          <w:p>
+            <w:r>
+              <w:t xml:space="preserve">6.5.6 Video calls: showing who is communicating</w:t>
+            </w:r>
+          </w:p>
+        </w:tc>
+        <w:tc>
+          <w:tcPr>
+            <w:tcW w:w="1800" w:type="dxa"/>
+          </w:tcPr>
+          <w:p>
+            <w:r>
+              <w:t>Not Applicable</w:t>
+            </w:r>
+          </w:p>
+        </w:tc>
+        <w:tc>
+          <w:tcPr>
+            <w:tcW w:w="4560" w:type="dxa"/>
+          </w:tcPr>
+          <w:p>
+            <w:r>
+              <w:t xml:space="preserve">The product offers no two-way voice or video communication.</w:t>
+            </w:r>
+          </w:p>
+        </w:tc>
+      </w:tr>
+      <w:tr>
+        <w:trPr>
+          <w:cantSplit/>
+        </w:trPr>
+        <w:tc>
+          <w:tcPr>
+            <w:tcW w:w="3000" w:type="dxa"/>
+          </w:tcPr>
+          <w:p>
+            <w:r>
+              <w:t xml:space="preserve">6.6 Video services: an alternative to video</w:t>
+            </w:r>
+          </w:p>
+        </w:tc>
+        <w:tc>
+          <w:tcPr>
+            <w:tcW w:w="1800" w:type="dxa"/>
+          </w:tcPr>
+          <w:p>
+            <w:r>
+              <w:t>Not Applicable</w:t>
+            </w:r>
+          </w:p>
+        </w:tc>
+        <w:tc>
+          <w:tcPr>
+            <w:tcW w:w="4560" w:type="dxa"/>
+          </w:tcPr>
+          <w:p>
+            <w:r>
+              <w:t xml:space="preserve">The product offers no two-way voice or video communication.</w:t>
+            </w:r>
+          </w:p>
+        </w:tc>
+      </w:tr>
+      <w:tr>
+        <w:trPr>
+          <w:cantSplit/>
+        </w:trPr>
+        <w:tc>
+          <w:tcPr>
+            <w:tcW w:w="3000" w:type="dxa"/>
+          </w:tcPr>
+          <w:p>
+            <w:r>
+              <w:t xml:space="preserve">6.7.1 Voice, video and text in one call</w:t>
+            </w:r>
+          </w:p>
+        </w:tc>
+        <w:tc>
+          <w:tcPr>
+            <w:tcW w:w="1800" w:type="dxa"/>
+          </w:tcPr>
+          <w:p>
+            <w:r>
+              <w:t>Not Applicable</w:t>
+            </w:r>
+          </w:p>
+        </w:tc>
+        <w:tc>
+          <w:tcPr>
+            <w:tcW w:w="4560" w:type="dxa"/>
+          </w:tcPr>
+          <w:p>
+            <w:r>
+              <w:t xml:space="preserve">The product offers no two-way voice or video communication.</w:t>
+            </w:r>
+          </w:p>
+        </w:tc>
+      </w:tr>
+      <w:tr>
+        <w:trPr>
+          <w:cantSplit/>
+        </w:trPr>
+        <w:tc>
+          <w:tcPr>
+            <w:tcW w:w="3000" w:type="dxa"/>
+          </w:tcPr>
+          <w:p>
+            <w:r>
+              <w:t xml:space="preserve">6.7.2 Voice, video and text: interoperability documented</w:t>
+            </w:r>
+          </w:p>
+        </w:tc>
+        <w:tc>
+          <w:tcPr>
+            <w:tcW w:w="1800" w:type="dxa"/>
+          </w:tcPr>
+          <w:p>
+            <w:r>
+              <w:t>Not Applicable</w:t>
+            </w:r>
+          </w:p>
+        </w:tc>
+        <w:tc>
+          <w:tcPr>
+            <w:tcW w:w="4560" w:type="dxa"/>
+          </w:tcPr>
+          <w:p>
+            <w:r>
+              <w:t xml:space="preserve">The product offers no two-way voice or video communication.</w:t>
+            </w:r>
+          </w:p>
+        </w:tc>
+      </w:tr>
+      <w:tr>
+        <w:trPr>
+          <w:cantSplit/>
+        </w:trPr>
+        <w:tc>
+          <w:tcPr>
+            <w:tcW w:w="3000" w:type="dxa"/>
+          </w:tcPr>
+          <w:p>
+            <w:r>
+              <w:t xml:space="preserve">7.1.1 Subtitles: shown when present</w:t>
             </w:r>
           </w:p>
         </w:tc>
@@ -8081,7 +8676,7 @@
           </w:tcPr>
           <w:p>
             <w:r>
-              <w:t xml:space="preserve">7.1.2 Captions: keeping them in step</w:t>
+              <w:t xml:space="preserve">7.1.2 Subtitles: in step with the sound</w:t>
             </w:r>
           </w:p>
         </w:tc>
@@ -8116,7 +8711,7 @@
           </w:tcPr>
           <w:p>
             <w:r>
-              <w:t xml:space="preserve">7.1.3 Captions: keeping them</w:t>
+              <w:t xml:space="preserve">7.1.3 Subtitles: not lost on the way</w:t>
             </w:r>
           </w:p>
         </w:tc>
@@ -8151,7 +8746,7 @@
           </w:tcPr>
           <w:p>
             <w:r>
-              <w:t xml:space="preserve">7.1.4 Captions: how they look</w:t>
+              <w:t xml:space="preserve">7.1.4 Subtitles: appearance adjustable</w:t>
             </w:r>
           </w:p>
         </w:tc>
@@ -8186,7 +8781,7 @@
           </w:tcPr>
           <w:p>
             <w:r>
-              <w:t xml:space="preserve">7.1.5 Spoken subtitles</w:t>
+              <w:t xml:space="preserve">7.1.5 Subtitles read aloud</w:t>
             </w:r>
           </w:p>
         </w:tc>
@@ -8221,7 +8816,7 @@
           </w:tcPr>
           <w:p>
             <w:r>
-              <w:t xml:space="preserve">7.2.1 Audio description: playing it</w:t>
+              <w:t xml:space="preserve">7.2.1 Audio description: played when present</w:t>
             </w:r>
           </w:p>
         </w:tc>
@@ -8256,7 +8851,7 @@
           </w:tcPr>
           <w:p>
             <w:r>
-              <w:t xml:space="preserve">7.2.2 Audio description: keeping it in step</w:t>
+              <w:t xml:space="preserve">7.2.2 Audio description: in step with the picture</w:t>
             </w:r>
           </w:p>
         </w:tc>
@@ -8291,7 +8886,7 @@
           </w:tcPr>
           <w:p>
             <w:r>
-              <w:t xml:space="preserve">7.2.3 Audio description: keeping it</w:t>
+              <w:t xml:space="preserve">7.2.3 Audio description: not lost on the way</w:t>
             </w:r>
           </w:p>
         </w:tc>
@@ -8326,7 +8921,7 @@
           </w:tcPr>
           <w:p>
             <w:r>
-              <w:t xml:space="preserve">7.3 Controls for captions and audio description</w:t>
+              <w:t xml:space="preserve">7.3 Controls for subtitles and audio description</w:t>
             </w:r>
           </w:p>
         </w:tc>
@@ -8361,7 +8956,7 @@
           </w:tcPr>
           <w:p>
             <w:r>
-              <w:t xml:space="preserve">8.1.1 Hardware: general</w:t>
+              <w:t xml:space="preserve">8.2.1.1 Hardware speech: amplification</w:t>
             </w:r>
           </w:p>
         </w:tc>
@@ -8396,7 +8991,7 @@
           </w:tcPr>
           <w:p>
             <w:r>
-              <w:t xml:space="preserve">8.1.2 Hardware: standard connections</w:t>
+              <w:t xml:space="preserve">8.2.1.2 Hardware speech: raising the volume in steps</w:t>
             </w:r>
           </w:p>
         </w:tc>
@@ -8431,7 +9026,7 @@
           </w:tcPr>
           <w:p>
             <w:r>
-              <w:t xml:space="preserve">8.1.3 Hardware: colour</w:t>
+              <w:t xml:space="preserve">8.2.2.1 Hearing-aid coupling: fixed-line products</w:t>
             </w:r>
           </w:p>
         </w:tc>
@@ -8466,7 +9061,7 @@
           </w:tcPr>
           <w:p>
             <w:r>
-              <w:t xml:space="preserve">8.2.1.1 Hardware speech: volume range</w:t>
+              <w:t xml:space="preserve">8.2.2.2 Hearing-aid coupling: wireless products</w:t>
             </w:r>
           </w:p>
         </w:tc>
@@ -8501,7 +9096,7 @@
           </w:tcPr>
           <w:p>
             <w:r>
-              <w:t xml:space="preserve">8.2.1.2 Hardware speech: stepping the volume</w:t>
+              <w:t xml:space="preserve">8.3.2 Stationary products: how low a screen may sit</w:t>
             </w:r>
           </w:p>
         </w:tc>
@@ -8536,7 +9131,7 @@
           </w:tcPr>
           <w:p>
             <w:r>
-              <w:t xml:space="preserve">8.2.2.1 Magnetic coupling: fixed-line devices</w:t>
+              <w:t xml:space="preserve">8.3.3.1 Stationary products: how high information may sit</w:t>
             </w:r>
           </w:p>
         </w:tc>
@@ -8571,7 +9166,7 @@
           </w:tcPr>
           <w:p>
             <w:r>
-              <w:t xml:space="preserve">8.2.2.2 Magnetic coupling: wireless devices</w:t>
+              <w:t xml:space="preserve">8.3.3.2 Stationary products: how high information may sit, where design limits it</w:t>
             </w:r>
           </w:p>
         </w:tc>
@@ -8606,7 +9201,7 @@
           </w:tcPr>
           <w:p>
             <w:r>
-              <w:t xml:space="preserve">8.3 Stationary products: physical access</w:t>
+              <w:t xml:space="preserve">8.3.5.1 Stationary products: height of controls</w:t>
             </w:r>
           </w:p>
         </w:tc>
@@ -8641,7 +9236,7 @@
           </w:tcPr>
           <w:p>
             <w:r>
-              <w:t xml:space="preserve">8.4.1 Mechanically operable parts: numeric keys</w:t>
+              <w:t xml:space="preserve">8.3.5.2 Stationary products: height of controls, where design limits it</w:t>
             </w:r>
           </w:p>
         </w:tc>
@@ -8676,7 +9271,7 @@
           </w:tcPr>
           <w:p>
             <w:r>
-              <w:t xml:space="preserve">8.4.2.1 Mechanically operable parts: how they are operated</w:t>
+              <w:t xml:space="preserve">8.3.6 Stationary products: width of the control area</w:t>
             </w:r>
           </w:p>
         </w:tc>
@@ -8711,7 +9306,7 @@
           </w:tcPr>
           <w:p>
             <w:r>
-              <w:t xml:space="preserve">8.4.2.2 Mechanically operable parts: force</w:t>
+              <w:t xml:space="preserve">8.3.7.1 Stationary products: depth of the control area</w:t>
             </w:r>
           </w:p>
         </w:tc>
@@ -8746,7 +9341,7 @@
           </w:tcPr>
           <w:p>
             <w:r>
-              <w:t xml:space="preserve">8.4.3 Keys, tickets and fare cards</w:t>
+              <w:t xml:space="preserve">8.3.7.2 Stationary products: depth of the control area, where design limits it</w:t>
             </w:r>
           </w:p>
         </w:tc>
@@ -8781,7 +9376,7 @@
           </w:tcPr>
           <w:p>
             <w:r>
-              <w:t xml:space="preserve">8.5 Tactile indication of speech mode</w:t>
+              <w:t xml:space="preserve">8.3.9.2 Stationary products: reaching forward over an obstruction</w:t>
             </w:r>
           </w:p>
         </w:tc>
@@ -8816,7 +9411,497 @@
           </w:tcPr>
           <w:p>
             <w:r>
-              <w:t xml:space="preserve">11.5.2.1 Accessibility services: software with a user interface</w:t>
+              <w:t xml:space="preserve">8.3.9.3 Stationary products: reaching forward over a deep obstruction</w:t>
+            </w:r>
+          </w:p>
+        </w:tc>
+        <w:tc>
+          <w:tcPr>
+            <w:tcW w:w="1800" w:type="dxa"/>
+          </w:tcPr>
+          <w:p>
+            <w:r>
+              <w:t>Not Applicable</w:t>
+            </w:r>
+          </w:p>
+        </w:tc>
+        <w:tc>
+          <w:tcPr>
+            <w:tcW w:w="4560" w:type="dxa"/>
+          </w:tcPr>
+          <w:p>
+            <w:r>
+              <w:t xml:space="preserve">The product is software and has no hardware.</w:t>
+            </w:r>
+          </w:p>
+        </w:tc>
+      </w:tr>
+      <w:tr>
+        <w:trPr>
+          <w:cantSplit/>
+        </w:trPr>
+        <w:tc>
+          <w:tcPr>
+            <w:tcW w:w="3000" w:type="dxa"/>
+          </w:tcPr>
+          <w:p>
+            <w:r>
+              <w:t xml:space="preserve">8.3.10.2 Stationary products: reaching sideways over an obstruction</w:t>
+            </w:r>
+          </w:p>
+        </w:tc>
+        <w:tc>
+          <w:tcPr>
+            <w:tcW w:w="1800" w:type="dxa"/>
+          </w:tcPr>
+          <w:p>
+            <w:r>
+              <w:t>Not Applicable</w:t>
+            </w:r>
+          </w:p>
+        </w:tc>
+        <w:tc>
+          <w:tcPr>
+            <w:tcW w:w="4560" w:type="dxa"/>
+          </w:tcPr>
+          <w:p>
+            <w:r>
+              <w:t xml:space="preserve">The product is software and has no hardware.</w:t>
+            </w:r>
+          </w:p>
+        </w:tc>
+      </w:tr>
+      <w:tr>
+        <w:trPr>
+          <w:cantSplit/>
+        </w:trPr>
+        <w:tc>
+          <w:tcPr>
+            <w:tcW w:w="3000" w:type="dxa"/>
+          </w:tcPr>
+          <w:p>
+            <w:r>
+              <w:t xml:space="preserve">8.3.10.3 Stationary products: reaching sideways over a deep obstruction</w:t>
+            </w:r>
+          </w:p>
+        </w:tc>
+        <w:tc>
+          <w:tcPr>
+            <w:tcW w:w="1800" w:type="dxa"/>
+          </w:tcPr>
+          <w:p>
+            <w:r>
+              <w:t>Not Applicable</w:t>
+            </w:r>
+          </w:p>
+        </w:tc>
+        <w:tc>
+          <w:tcPr>
+            <w:tcW w:w="4560" w:type="dxa"/>
+          </w:tcPr>
+          <w:p>
+            <w:r>
+              <w:t xml:space="preserve">The product is software and has no hardware.</w:t>
+            </w:r>
+          </w:p>
+        </w:tc>
+      </w:tr>
+      <w:tr>
+        <w:trPr>
+          <w:cantSplit/>
+        </w:trPr>
+        <w:tc>
+          <w:tcPr>
+            <w:tcW w:w="3000" w:type="dxa"/>
+          </w:tcPr>
+          <w:p>
+            <w:r>
+              <w:t xml:space="preserve">8.3.11.1 Stationary products: room for knees and toes</w:t>
+            </w:r>
+          </w:p>
+        </w:tc>
+        <w:tc>
+          <w:tcPr>
+            <w:tcW w:w="1800" w:type="dxa"/>
+          </w:tcPr>
+          <w:p>
+            <w:r>
+              <w:t>Not Applicable</w:t>
+            </w:r>
+          </w:p>
+        </w:tc>
+        <w:tc>
+          <w:tcPr>
+            <w:tcW w:w="4560" w:type="dxa"/>
+          </w:tcPr>
+          <w:p>
+            <w:r>
+              <w:t xml:space="preserve">The product is software and has no hardware.</w:t>
+            </w:r>
+          </w:p>
+        </w:tc>
+      </w:tr>
+      <w:tr>
+        <w:trPr>
+          <w:cantSplit/>
+        </w:trPr>
+        <w:tc>
+          <w:tcPr>
+            <w:tcW w:w="3000" w:type="dxa"/>
+          </w:tcPr>
+          <w:p>
+            <w:r>
+              <w:t xml:space="preserve">8.3.11.2 Stationary products: room for knees and toes, where design limits it</w:t>
+            </w:r>
+          </w:p>
+        </w:tc>
+        <w:tc>
+          <w:tcPr>
+            <w:tcW w:w="1800" w:type="dxa"/>
+          </w:tcPr>
+          <w:p>
+            <w:r>
+              <w:t>Not Applicable</w:t>
+            </w:r>
+          </w:p>
+        </w:tc>
+        <w:tc>
+          <w:tcPr>
+            <w:tcW w:w="4560" w:type="dxa"/>
+          </w:tcPr>
+          <w:p>
+            <w:r>
+              <w:t xml:space="preserve">The product is software and has no hardware.</w:t>
+            </w:r>
+          </w:p>
+        </w:tc>
+      </w:tr>
+      <w:tr>
+        <w:trPr>
+          <w:cantSplit/>
+        </w:trPr>
+        <w:tc>
+          <w:tcPr>
+            <w:tcW w:w="3000" w:type="dxa"/>
+          </w:tcPr>
+          <w:p>
+            <w:r>
+              <w:t xml:space="preserve">8.3.14 Stationary products: guidance for installers</w:t>
+            </w:r>
+          </w:p>
+        </w:tc>
+        <w:tc>
+          <w:tcPr>
+            <w:tcW w:w="1800" w:type="dxa"/>
+          </w:tcPr>
+          <w:p>
+            <w:r>
+              <w:t>Not Applicable</w:t>
+            </w:r>
+          </w:p>
+        </w:tc>
+        <w:tc>
+          <w:tcPr>
+            <w:tcW w:w="4560" w:type="dxa"/>
+          </w:tcPr>
+          <w:p>
+            <w:r>
+              <w:t xml:space="preserve">The product is software and has no hardware.</w:t>
+            </w:r>
+          </w:p>
+        </w:tc>
+      </w:tr>
+      <w:tr>
+        <w:trPr>
+          <w:cantSplit/>
+        </w:trPr>
+        <w:tc>
+          <w:tcPr>
+            <w:tcW w:w="3000" w:type="dxa"/>
+          </w:tcPr>
+          <w:p>
+            <w:r>
+              <w:t xml:space="preserve">8.4.1 Number keys laid out as usual</w:t>
+            </w:r>
+          </w:p>
+        </w:tc>
+        <w:tc>
+          <w:tcPr>
+            <w:tcW w:w="1800" w:type="dxa"/>
+          </w:tcPr>
+          <w:p>
+            <w:r>
+              <w:t>Not Applicable</w:t>
+            </w:r>
+          </w:p>
+        </w:tc>
+        <w:tc>
+          <w:tcPr>
+            <w:tcW w:w="4560" w:type="dxa"/>
+          </w:tcPr>
+          <w:p>
+            <w:r>
+              <w:t xml:space="preserve">The product is software and has no hardware.</w:t>
+            </w:r>
+          </w:p>
+        </w:tc>
+      </w:tr>
+      <w:tr>
+        <w:trPr>
+          <w:cantSplit/>
+        </w:trPr>
+        <w:tc>
+          <w:tcPr>
+            <w:tcW w:w="3000" w:type="dxa"/>
+          </w:tcPr>
+          <w:p>
+            <w:r>
+              <w:t xml:space="preserve">8.4.2.1 Mechanical controls: no grip or twist needed</w:t>
+            </w:r>
+          </w:p>
+        </w:tc>
+        <w:tc>
+          <w:tcPr>
+            <w:tcW w:w="1800" w:type="dxa"/>
+          </w:tcPr>
+          <w:p>
+            <w:r>
+              <w:t>Not Applicable</w:t>
+            </w:r>
+          </w:p>
+        </w:tc>
+        <w:tc>
+          <w:tcPr>
+            <w:tcW w:w="4560" w:type="dxa"/>
+          </w:tcPr>
+          <w:p>
+            <w:r>
+              <w:t xml:space="preserve">The product is software and has no hardware.</w:t>
+            </w:r>
+          </w:p>
+        </w:tc>
+      </w:tr>
+      <w:tr>
+        <w:trPr>
+          <w:cantSplit/>
+        </w:trPr>
+        <w:tc>
+          <w:tcPr>
+            <w:tcW w:w="3000" w:type="dxa"/>
+          </w:tcPr>
+          <w:p>
+            <w:r>
+              <w:t xml:space="preserve">8.4.2.2 Mechanical controls: light enough to press</w:t>
+            </w:r>
+          </w:p>
+        </w:tc>
+        <w:tc>
+          <w:tcPr>
+            <w:tcW w:w="1800" w:type="dxa"/>
+          </w:tcPr>
+          <w:p>
+            <w:r>
+              <w:t>Not Applicable</w:t>
+            </w:r>
+          </w:p>
+        </w:tc>
+        <w:tc>
+          <w:tcPr>
+            <w:tcW w:w="4560" w:type="dxa"/>
+          </w:tcPr>
+          <w:p>
+            <w:r>
+              <w:t xml:space="preserve">The product is software and has no hardware.</w:t>
+            </w:r>
+          </w:p>
+        </w:tc>
+      </w:tr>
+      <w:tr>
+        <w:trPr>
+          <w:cantSplit/>
+        </w:trPr>
+        <w:tc>
+          <w:tcPr>
+            <w:tcW w:w="3000" w:type="dxa"/>
+          </w:tcPr>
+          <w:p>
+            <w:r>
+              <w:t xml:space="preserve">8.4.3 Cards and tickets that can be oriented by touch</w:t>
+            </w:r>
+          </w:p>
+        </w:tc>
+        <w:tc>
+          <w:tcPr>
+            <w:tcW w:w="1800" w:type="dxa"/>
+          </w:tcPr>
+          <w:p>
+            <w:r>
+              <w:t>Not Applicable</w:t>
+            </w:r>
+          </w:p>
+        </w:tc>
+        <w:tc>
+          <w:tcPr>
+            <w:tcW w:w="4560" w:type="dxa"/>
+          </w:tcPr>
+          <w:p>
+            <w:r>
+              <w:t xml:space="preserve">The product is software and has no hardware.</w:t>
+            </w:r>
+          </w:p>
+        </w:tc>
+      </w:tr>
+      <w:tr>
+        <w:trPr>
+          <w:cantSplit/>
+        </w:trPr>
+        <w:tc>
+          <w:tcPr>
+            <w:tcW w:w="3000" w:type="dxa"/>
+          </w:tcPr>
+          <w:p>
+            <w:r>
+              <w:t xml:space="preserve">8.5 Finding the speech mode by touch</w:t>
+            </w:r>
+          </w:p>
+        </w:tc>
+        <w:tc>
+          <w:tcPr>
+            <w:tcW w:w="1800" w:type="dxa"/>
+          </w:tcPr>
+          <w:p>
+            <w:r>
+              <w:t>Not Applicable</w:t>
+            </w:r>
+          </w:p>
+        </w:tc>
+        <w:tc>
+          <w:tcPr>
+            <w:tcW w:w="4560" w:type="dxa"/>
+          </w:tcPr>
+          <w:p>
+            <w:r>
+              <w:t xml:space="preserve">The product is software and has no hardware.</w:t>
+            </w:r>
+          </w:p>
+        </w:tc>
+      </w:tr>
+      <w:tr>
+        <w:trPr>
+          <w:cantSplit/>
+        </w:trPr>
+        <w:tc>
+          <w:tcPr>
+            <w:tcW w:w="3000" w:type="dxa"/>
+          </w:tcPr>
+          <w:p>
+            <w:r>
+              <w:t xml:space="preserve">8.6 Connections that follow an industry standard</w:t>
+            </w:r>
+          </w:p>
+        </w:tc>
+        <w:tc>
+          <w:tcPr>
+            <w:tcW w:w="1800" w:type="dxa"/>
+          </w:tcPr>
+          <w:p>
+            <w:r>
+              <w:t>Not Applicable</w:t>
+            </w:r>
+          </w:p>
+        </w:tc>
+        <w:tc>
+          <w:tcPr>
+            <w:tcW w:w="4560" w:type="dxa"/>
+          </w:tcPr>
+          <w:p>
+            <w:r>
+              <w:t xml:space="preserve">The product is software and has no hardware.</w:t>
+            </w:r>
+          </w:p>
+        </w:tc>
+      </w:tr>
+      <w:tr>
+        <w:trPr>
+          <w:cantSplit/>
+        </w:trPr>
+        <w:tc>
+          <w:tcPr>
+            <w:tcW w:w="3000" w:type="dxa"/>
+          </w:tcPr>
+          <w:p>
+            <w:r>
+              <w:t xml:space="preserve">8.7 Hardware: colour never the only cue</w:t>
+            </w:r>
+          </w:p>
+        </w:tc>
+        <w:tc>
+          <w:tcPr>
+            <w:tcW w:w="1800" w:type="dxa"/>
+          </w:tcPr>
+          <w:p>
+            <w:r>
+              <w:t>Not Applicable</w:t>
+            </w:r>
+          </w:p>
+        </w:tc>
+        <w:tc>
+          <w:tcPr>
+            <w:tcW w:w="4560" w:type="dxa"/>
+          </w:tcPr>
+          <w:p>
+            <w:r>
+              <w:t xml:space="preserve">The product is software and has no hardware.</w:t>
+            </w:r>
+          </w:p>
+        </w:tc>
+      </w:tr>
+      <w:tr>
+        <w:trPr>
+          <w:cantSplit/>
+        </w:trPr>
+        <w:tc>
+          <w:tcPr>
+            <w:tcW w:w="3000" w:type="dxa"/>
+          </w:tcPr>
+          <w:p>
+            <w:r>
+              <w:t xml:space="preserve">8.8 Hardware: markings that stand out</w:t>
+            </w:r>
+          </w:p>
+        </w:tc>
+        <w:tc>
+          <w:tcPr>
+            <w:tcW w:w="1800" w:type="dxa"/>
+          </w:tcPr>
+          <w:p>
+            <w:r>
+              <w:t>Not Applicable</w:t>
+            </w:r>
+          </w:p>
+        </w:tc>
+        <w:tc>
+          <w:tcPr>
+            <w:tcW w:w="4560" w:type="dxa"/>
+          </w:tcPr>
+          <w:p>
+            <w:r>
+              <w:t xml:space="preserve">The product is software and has no hardware.</w:t>
+            </w:r>
+          </w:p>
+        </w:tc>
+      </w:tr>
+      <w:tr>
+        <w:trPr>
+          <w:cantSplit/>
+        </w:trPr>
+        <w:tc>
+          <w:tcPr>
+            <w:tcW w:w="3000" w:type="dxa"/>
+          </w:tcPr>
+          <w:p>
+            <w:r>
+              <w:t xml:space="preserve">11.5.2.1 Platforms: accessibility services for assistive technology</w:t>
             </w:r>
           </w:p>
         </w:tc>
@@ -8851,7 +9936,7 @@
           </w:tcPr>
           <w:p>
             <w:r>
-              <w:t xml:space="preserve">11.5.2.2 Accessibility services: assistive technologies</w:t>
+              <w:t xml:space="preserve">11.5.2.3 Software: using the platform's services</w:t>
             </w:r>
           </w:p>
         </w:tc>
@@ -8886,7 +9971,7 @@
           </w:tcPr>
           <w:p>
             <w:r>
-              <w:t xml:space="preserve">11.5.2.3 Accessibility services: using them</w:t>
+              <w:t xml:space="preserve">11.5.2.4 Assistive technology: using the platform's services</w:t>
             </w:r>
           </w:p>
         </w:tc>
@@ -8921,7 +10006,7 @@
           </w:tcPr>
           <w:p>
             <w:r>
-              <w:t xml:space="preserve">11.5.2.4 Assistive technology: using the services</w:t>
+              <w:t xml:space="preserve">11.5.2.5 Software exposes what each element is</w:t>
             </w:r>
           </w:p>
         </w:tc>
@@ -8956,7 +10041,7 @@
           </w:tcPr>
           <w:p>
             <w:r>
-              <w:t xml:space="preserve">11.5.2.5 Object information</w:t>
+              <w:t xml:space="preserve">11.5.2.6 Software exposes table cells and headers</w:t>
             </w:r>
           </w:p>
         </w:tc>
@@ -8991,7 +10076,7 @@
           </w:tcPr>
           <w:p>
             <w:r>
-              <w:t xml:space="preserve">11.5.2.6 Rows, columns and headers</w:t>
+              <w:t xml:space="preserve">11.5.2.7 Software exposes current values</w:t>
             </w:r>
           </w:p>
         </w:tc>
@@ -9026,7 +10111,7 @@
           </w:tcPr>
           <w:p>
             <w:r>
-              <w:t xml:space="preserve">11.5.2.7 Values</w:t>
+              <w:t xml:space="preserve">11.5.2.8 Software exposes which element labels which</w:t>
             </w:r>
           </w:p>
         </w:tc>
@@ -9061,7 +10146,7 @@
           </w:tcPr>
           <w:p>
             <w:r>
-              <w:t xml:space="preserve">11.5.2.8 Label relationships</w:t>
+              <w:t xml:space="preserve">11.5.2.9 Software exposes how elements nest</w:t>
             </w:r>
           </w:p>
         </w:tc>
@@ -9096,7 +10181,7 @@
           </w:tcPr>
           <w:p>
             <w:r>
-              <w:t xml:space="preserve">11.5.2.9 Parent and child relationships</w:t>
+              <w:t xml:space="preserve">11.5.2.10 Software exposes its text</w:t>
             </w:r>
           </w:p>
         </w:tc>
@@ -9131,7 +10216,7 @@
           </w:tcPr>
           <w:p>
             <w:r>
-              <w:t xml:space="preserve">11.5.2.10 Text</w:t>
+              <w:t xml:space="preserve">11.5.2.11 Software exposes the actions an element offers</w:t>
             </w:r>
           </w:p>
         </w:tc>
@@ -9166,7 +10251,7 @@
           </w:tcPr>
           <w:p>
             <w:r>
-              <w:t xml:space="preserve">11.5.2.11 Available actions: listing them</w:t>
+              <w:t xml:space="preserve">11.5.2.12 Software lets assistive technology carry out actions</w:t>
             </w:r>
           </w:p>
         </w:tc>
@@ -9201,7 +10286,7 @@
           </w:tcPr>
           <w:p>
             <w:r>
-              <w:t xml:space="preserve">11.5.2.12 Available actions: carrying them out</w:t>
+              <w:t xml:space="preserve">11.5.2.13 Software exposes focus and selection</w:t>
             </w:r>
           </w:p>
         </w:tc>
@@ -9236,7 +10321,7 @@
           </w:tcPr>
           <w:p>
             <w:r>
-              <w:t xml:space="preserve">11.5.2.13 Focus and selection: tracking them</w:t>
+              <w:t xml:space="preserve">11.5.2.14 Software lets assistive technology move focus and selection</w:t>
             </w:r>
           </w:p>
         </w:tc>
@@ -9271,7 +10356,7 @@
           </w:tcPr>
           <w:p>
             <w:r>
-              <w:t xml:space="preserve">11.5.2.14 Focus and selection: changing them</w:t>
+              <w:t xml:space="preserve">11.5.2.15 Software announces changes</w:t>
             </w:r>
           </w:p>
         </w:tc>
@@ -9306,7 +10391,7 @@
           </w:tcPr>
           <w:p>
             <w:r>
-              <w:t xml:space="preserve">11.5.2.15 Change notification</w:t>
+              <w:t xml:space="preserve">11.5.2.16 Software lets assistive technology change states</w:t>
             </w:r>
           </w:p>
         </w:tc>
@@ -9341,7 +10426,7 @@
           </w:tcPr>
           <w:p>
             <w:r>
-              <w:t xml:space="preserve">11.5.2.16 States and properties: changing them</w:t>
+              <w:t xml:space="preserve">11.5.2.17 Software lets assistive technology change values and text</w:t>
             </w:r>
           </w:p>
         </w:tc>
@@ -9376,42 +10461,7 @@
           </w:tcPr>
           <w:p>
             <w:r>
-              <w:t xml:space="preserve">11.5.2.17 Values and text: changing them</w:t>
-            </w:r>
-          </w:p>
-        </w:tc>
-        <w:tc>
-          <w:tcPr>
-            <w:tcW w:w="1800" w:type="dxa"/>
-          </w:tcPr>
-          <w:p>
-            <w:r>
-              <w:t>Not Applicable</w:t>
-            </w:r>
-          </w:p>
-        </w:tc>
-        <w:tc>
-          <w:tcPr>
-            <w:tcW w:w="4560" w:type="dxa"/>
-          </w:tcPr>
-          <w:p>
-            <w:r>
-              <w:t xml:space="preserve">The product is a web application, not a platform or assistive technology; the WCAG table answers its interoperability with assistive technology.</w:t>
-            </w:r>
-          </w:p>
-        </w:tc>
-      </w:tr>
-      <w:tr>
-        <w:trPr>
-          <w:cantSplit/>
-        </w:trPr>
-        <w:tc>
-          <w:tcPr>
-            <w:tcW w:w="3000" w:type="dxa"/>
-          </w:tcPr>
-          <w:p>
-            <w:r>
-              <w:t xml:space="preserve">11.6.1 Documented accessibility: user control</w:t>
+              <w:t xml:space="preserve">11.6.1 Software: users control its accessibility features</w:t>
             </w:r>
           </w:p>
         </w:tc>
@@ -9446,7 +10496,7 @@
           </w:tcPr>
           <w:p>
             <w:r>
-              <w:t xml:space="preserve">11.6.2 Documented accessibility: no disruption</w:t>
+              <w:t xml:space="preserve">11.6.2 Software: the platform's accessibility features left working</w:t>
             </w:r>
           </w:p>
         </w:tc>
@@ -9481,7 +10531,7 @@
           </w:tcPr>
           <w:p>
             <w:r>
-              <w:t xml:space="preserve">11.7 User preferences</w:t>
+              <w:t xml:space="preserve">11.7 Software follows the user's platform settings</w:t>
             </w:r>
           </w:p>
         </w:tc>
@@ -9516,182 +10566,7 @@
           </w:tcPr>
           <w:p>
             <w:r>
-              <w:t xml:space="preserve">11.8.1 Authoring tools: content technology</w:t>
-            </w:r>
-          </w:p>
-        </w:tc>
-        <w:tc>
-          <w:tcPr>
-            <w:tcW w:w="1800" w:type="dxa"/>
-          </w:tcPr>
-          <w:p>
-            <w:r>
-              <w:t>Not Applicable</w:t>
-            </w:r>
-          </w:p>
-        </w:tc>
-        <w:tc>
-          <w:tcPr>
-            <w:tcW w:w="4560" w:type="dxa"/>
-          </w:tcPr>
-          <w:p>
-            <w:r>
-              <w:t xml:space="preserve">The product is not an authoring tool.</w:t>
-            </w:r>
-          </w:p>
-        </w:tc>
-      </w:tr>
-      <w:tr>
-        <w:trPr>
-          <w:cantSplit/>
-        </w:trPr>
-        <w:tc>
-          <w:tcPr>
-            <w:tcW w:w="3000" w:type="dxa"/>
-          </w:tcPr>
-          <w:p>
-            <w:r>
-              <w:t xml:space="preserve">11.8.2 Authoring tools: creating accessible content</w:t>
-            </w:r>
-          </w:p>
-        </w:tc>
-        <w:tc>
-          <w:tcPr>
-            <w:tcW w:w="1800" w:type="dxa"/>
-          </w:tcPr>
-          <w:p>
-            <w:r>
-              <w:t>Not Applicable</w:t>
-            </w:r>
-          </w:p>
-        </w:tc>
-        <w:tc>
-          <w:tcPr>
-            <w:tcW w:w="4560" w:type="dxa"/>
-          </w:tcPr>
-          <w:p>
-            <w:r>
-              <w:t xml:space="preserve">The product is not an authoring tool.</w:t>
-            </w:r>
-          </w:p>
-        </w:tc>
-      </w:tr>
-      <w:tr>
-        <w:trPr>
-          <w:cantSplit/>
-        </w:trPr>
-        <w:tc>
-          <w:tcPr>
-            <w:tcW w:w="3000" w:type="dxa"/>
-          </w:tcPr>
-          <w:p>
-            <w:r>
-              <w:t xml:space="preserve">11.8.3 Authoring tools: keeping accessibility through transformation</w:t>
-            </w:r>
-          </w:p>
-        </w:tc>
-        <w:tc>
-          <w:tcPr>
-            <w:tcW w:w="1800" w:type="dxa"/>
-          </w:tcPr>
-          <w:p>
-            <w:r>
-              <w:t>Not Applicable</w:t>
-            </w:r>
-          </w:p>
-        </w:tc>
-        <w:tc>
-          <w:tcPr>
-            <w:tcW w:w="4560" w:type="dxa"/>
-          </w:tcPr>
-          <w:p>
-            <w:r>
-              <w:t xml:space="preserve">The product is not an authoring tool.</w:t>
-            </w:r>
-          </w:p>
-        </w:tc>
-      </w:tr>
-      <w:tr>
-        <w:trPr>
-          <w:cantSplit/>
-        </w:trPr>
-        <w:tc>
-          <w:tcPr>
-            <w:tcW w:w="3000" w:type="dxa"/>
-          </w:tcPr>
-          <w:p>
-            <w:r>
-              <w:t xml:space="preserve">11.8.4 Authoring tools: help with repairs</w:t>
-            </w:r>
-          </w:p>
-        </w:tc>
-        <w:tc>
-          <w:tcPr>
-            <w:tcW w:w="1800" w:type="dxa"/>
-          </w:tcPr>
-          <w:p>
-            <w:r>
-              <w:t>Not Applicable</w:t>
-            </w:r>
-          </w:p>
-        </w:tc>
-        <w:tc>
-          <w:tcPr>
-            <w:tcW w:w="4560" w:type="dxa"/>
-          </w:tcPr>
-          <w:p>
-            <w:r>
-              <w:t xml:space="preserve">The product is not an authoring tool.</w:t>
-            </w:r>
-          </w:p>
-        </w:tc>
-      </w:tr>
-      <w:tr>
-        <w:trPr>
-          <w:cantSplit/>
-        </w:trPr>
-        <w:tc>
-          <w:tcPr>
-            <w:tcW w:w="3000" w:type="dxa"/>
-          </w:tcPr>
-          <w:p>
-            <w:r>
-              <w:t xml:space="preserve">11.8.5 Authoring tools: templates</w:t>
-            </w:r>
-          </w:p>
-        </w:tc>
-        <w:tc>
-          <w:tcPr>
-            <w:tcW w:w="1800" w:type="dxa"/>
-          </w:tcPr>
-          <w:p>
-            <w:r>
-              <w:t>Not Applicable</w:t>
-            </w:r>
-          </w:p>
-        </w:tc>
-        <w:tc>
-          <w:tcPr>
-            <w:tcW w:w="4560" w:type="dxa"/>
-          </w:tcPr>
-          <w:p>
-            <w:r>
-              <w:t xml:space="preserve">The product is not an authoring tool.</w:t>
-            </w:r>
-          </w:p>
-        </w:tc>
-      </w:tr>
-      <w:tr>
-        <w:trPr>
-          <w:cantSplit/>
-        </w:trPr>
-        <w:tc>
-          <w:tcPr>
-            <w:tcW w:w="3000" w:type="dxa"/>
-          </w:tcPr>
-          <w:p>
-            <w:r>
-              <w:t xml:space="preserve">12.1.1 Product documentation: accessibility and compatibility features</w:t>
+              <w:t xml:space="preserve">12.1 Digital information about the product is accessible</w:t>
             </w:r>
           </w:p>
         </w:tc>
@@ -9711,22 +10586,22 @@
           </w:tcPr>
           <w:p>
             <w:r>
-              <w:t xml:space="preserve">The help centre's accessibility page lists and explains the product's accessibility features.</w:t>
-            </w:r>
-          </w:p>
-        </w:tc>
-      </w:tr>
-      <w:tr>
-        <w:trPr>
-          <w:cantSplit/>
-        </w:trPr>
-        <w:tc>
-          <w:tcPr>
-            <w:tcW w:w="3000" w:type="dxa"/>
-          </w:tcPr>
-          <w:p>
-            <w:r>
-              <w:t xml:space="preserve">12.1.2 Product documentation: accessible documentation</w:t>
+              <w:t xml:space="preserve">The product pages and the help centre meet the WCAG 2.2 criteria at Levels A and AA.</w:t>
+            </w:r>
+          </w:p>
+        </w:tc>
+      </w:tr>
+      <w:tr>
+        <w:trPr>
+          <w:cantSplit/>
+        </w:trPr>
+        <w:tc>
+          <w:tcPr>
+            <w:tcW w:w="3000" w:type="dxa"/>
+          </w:tcPr>
+          <w:p>
+            <w:r>
+              <w:t xml:space="preserve">12.2 Digital information on a service is accessible</w:t>
             </w:r>
           </w:p>
         </w:tc>
@@ -9746,22 +10621,22 @@
           </w:tcPr>
           <w:p>
             <w:r>
-              <w:t xml:space="preserve">The help centre meets the WCAG 2.2 criteria at Levels A and AA.</w:t>
-            </w:r>
-          </w:p>
-        </w:tc>
-      </w:tr>
-      <w:tr>
-        <w:trPr>
-          <w:cantSplit/>
-        </w:trPr>
-        <w:tc>
-          <w:tcPr>
-            <w:tcW w:w="3000" w:type="dxa"/>
-          </w:tcPr>
-          <w:p>
-            <w:r>
-              <w:t xml:space="preserve">12.2.2 Support services: information on accessibility features</w:t>
+              <w:t xml:space="preserve">The support pages, and documents sent by support as accessible PDF, meet the WCAG 2.2 criteria at Levels A and AA.</w:t>
+            </w:r>
+          </w:p>
+        </w:tc>
+      </w:tr>
+      <w:tr>
+        <w:trPr>
+          <w:cantSplit/>
+        </w:trPr>
+        <w:tc>
+          <w:tcPr>
+            <w:tcW w:w="3000" w:type="dxa"/>
+          </w:tcPr>
+          <w:p>
+            <w:r>
+              <w:t xml:space="preserve">12.3 Documentation explains the accessibility features</w:t>
             </w:r>
           </w:p>
         </w:tc>
@@ -9781,357 +10656,392 @@
           </w:tcPr>
           <w:p>
             <w:r>
-              <w:t xml:space="preserve">Support staff are trained to explain the product's accessibility features.</w:t>
-            </w:r>
-          </w:p>
-        </w:tc>
-      </w:tr>
-      <w:tr>
-        <w:trPr>
-          <w:cantSplit/>
-        </w:trPr>
-        <w:tc>
-          <w:tcPr>
-            <w:tcW w:w="3000" w:type="dxa"/>
-          </w:tcPr>
-          <w:p>
-            <w:r>
-              <w:t xml:space="preserve">12.2.3 Support services: effective communication</w:t>
-            </w:r>
-          </w:p>
-        </w:tc>
-        <w:tc>
-          <w:tcPr>
-            <w:tcW w:w="1800" w:type="dxa"/>
-          </w:tcPr>
-          <w:p>
-            <w:r>
-              <w:t>Supports</w:t>
-            </w:r>
-          </w:p>
-        </w:tc>
-        <w:tc>
-          <w:tcPr>
-            <w:tcW w:w="4560" w:type="dxa"/>
-          </w:tcPr>
-          <w:p>
-            <w:r>
-              <w:t xml:space="preserve">Support is offered by email, chat and telephone, and by relay services.</w:t>
-            </w:r>
-          </w:p>
-        </w:tc>
-      </w:tr>
-      <w:tr>
-        <w:trPr>
-          <w:cantSplit/>
-        </w:trPr>
-        <w:tc>
-          <w:tcPr>
-            <w:tcW w:w="3000" w:type="dxa"/>
-          </w:tcPr>
-          <w:p>
-            <w:r>
-              <w:t xml:space="preserve">12.2.4 Support services: accessible documentation</w:t>
-            </w:r>
-          </w:p>
-        </w:tc>
-        <w:tc>
-          <w:tcPr>
-            <w:tcW w:w="1800" w:type="dxa"/>
-          </w:tcPr>
-          <w:p>
-            <w:r>
-              <w:t>Supports</w:t>
-            </w:r>
-          </w:p>
-        </w:tc>
-        <w:tc>
-          <w:tcPr>
-            <w:tcW w:w="4560" w:type="dxa"/>
-          </w:tcPr>
-          <w:p>
-            <w:r>
-              <w:t xml:space="preserve">Documents from support are sent as accessible PDF or as web pages.</w:t>
-            </w:r>
-          </w:p>
-        </w:tc>
-      </w:tr>
-      <w:tr>
-        <w:trPr>
-          <w:cantSplit/>
-        </w:trPr>
-        <w:tc>
-          <w:tcPr>
-            <w:tcW w:w="3000" w:type="dxa"/>
-          </w:tcPr>
-          <w:p>
-            <w:r>
-              <w:t xml:space="preserve">13.1.1 Relay services: communication between users</w:t>
-            </w:r>
-          </w:p>
-        </w:tc>
-        <w:tc>
-          <w:tcPr>
-            <w:tcW w:w="1800" w:type="dxa"/>
-          </w:tcPr>
-          <w:p>
-            <w:r>
-              <w:t>Not Applicable</w:t>
-            </w:r>
-          </w:p>
-        </w:tc>
-        <w:tc>
-          <w:tcPr>
-            <w:tcW w:w="4560" w:type="dxa"/>
-          </w:tcPr>
-          <w:p>
-            <w:r>
-              <w:t xml:space="preserve">The product offers no relay or emergency service.</w:t>
-            </w:r>
-          </w:p>
-        </w:tc>
-      </w:tr>
-      <w:tr>
-        <w:trPr>
-          <w:cantSplit/>
-        </w:trPr>
-        <w:tc>
-          <w:tcPr>
-            <w:tcW w:w="3000" w:type="dxa"/>
-          </w:tcPr>
-          <w:p>
-            <w:r>
-              <w:t xml:space="preserve">13.1.2 Relay services: text</w:t>
-            </w:r>
-          </w:p>
-        </w:tc>
-        <w:tc>
-          <w:tcPr>
-            <w:tcW w:w="1800" w:type="dxa"/>
-          </w:tcPr>
-          <w:p>
-            <w:r>
-              <w:t>Not Applicable</w:t>
-            </w:r>
-          </w:p>
-        </w:tc>
-        <w:tc>
-          <w:tcPr>
-            <w:tcW w:w="4560" w:type="dxa"/>
-          </w:tcPr>
-          <w:p>
-            <w:r>
-              <w:t xml:space="preserve">The product offers no relay or emergency service.</w:t>
-            </w:r>
-          </w:p>
-        </w:tc>
-      </w:tr>
-      <w:tr>
-        <w:trPr>
-          <w:cantSplit/>
-        </w:trPr>
-        <w:tc>
-          <w:tcPr>
-            <w:tcW w:w="3000" w:type="dxa"/>
-          </w:tcPr>
-          <w:p>
-            <w:r>
-              <w:t xml:space="preserve">13.1.3 Relay services: sign language</w:t>
-            </w:r>
-          </w:p>
-        </w:tc>
-        <w:tc>
-          <w:tcPr>
-            <w:tcW w:w="1800" w:type="dxa"/>
-          </w:tcPr>
-          <w:p>
-            <w:r>
-              <w:t>Not Applicable</w:t>
-            </w:r>
-          </w:p>
-        </w:tc>
-        <w:tc>
-          <w:tcPr>
-            <w:tcW w:w="4560" w:type="dxa"/>
-          </w:tcPr>
-          <w:p>
-            <w:r>
-              <w:t xml:space="preserve">The product offers no relay or emergency service.</w:t>
-            </w:r>
-          </w:p>
-        </w:tc>
-      </w:tr>
-      <w:tr>
-        <w:trPr>
-          <w:cantSplit/>
-        </w:trPr>
-        <w:tc>
-          <w:tcPr>
-            <w:tcW w:w="3000" w:type="dxa"/>
-          </w:tcPr>
-          <w:p>
-            <w:r>
-              <w:t xml:space="preserve">13.1.4 Relay services: lip reading</w:t>
-            </w:r>
-          </w:p>
-        </w:tc>
-        <w:tc>
-          <w:tcPr>
-            <w:tcW w:w="1800" w:type="dxa"/>
-          </w:tcPr>
-          <w:p>
-            <w:r>
-              <w:t>Not Applicable</w:t>
-            </w:r>
-          </w:p>
-        </w:tc>
-        <w:tc>
-          <w:tcPr>
-            <w:tcW w:w="4560" w:type="dxa"/>
-          </w:tcPr>
-          <w:p>
-            <w:r>
-              <w:t xml:space="preserve">The product offers no relay or emergency service.</w:t>
-            </w:r>
-          </w:p>
-        </w:tc>
-      </w:tr>
-      <w:tr>
-        <w:trPr>
-          <w:cantSplit/>
-        </w:trPr>
-        <w:tc>
-          <w:tcPr>
-            <w:tcW w:w="3000" w:type="dxa"/>
-          </w:tcPr>
-          <w:p>
-            <w:r>
-              <w:t xml:space="preserve">13.1.5 Relay services: captioned telephony</w:t>
-            </w:r>
-          </w:p>
-        </w:tc>
-        <w:tc>
-          <w:tcPr>
-            <w:tcW w:w="1800" w:type="dxa"/>
-          </w:tcPr>
-          <w:p>
-            <w:r>
-              <w:t>Not Applicable</w:t>
-            </w:r>
-          </w:p>
-        </w:tc>
-        <w:tc>
-          <w:tcPr>
-            <w:tcW w:w="4560" w:type="dxa"/>
-          </w:tcPr>
-          <w:p>
-            <w:r>
-              <w:t xml:space="preserve">The product offers no relay or emergency service.</w:t>
-            </w:r>
-          </w:p>
-        </w:tc>
-      </w:tr>
-      <w:tr>
-        <w:trPr>
-          <w:cantSplit/>
-        </w:trPr>
-        <w:tc>
-          <w:tcPr>
-            <w:tcW w:w="3000" w:type="dxa"/>
-          </w:tcPr>
-          <w:p>
-            <w:r>
-              <w:t xml:space="preserve">13.1.6 Relay services: speech to speech</w:t>
-            </w:r>
-          </w:p>
-        </w:tc>
-        <w:tc>
-          <w:tcPr>
-            <w:tcW w:w="1800" w:type="dxa"/>
-          </w:tcPr>
-          <w:p>
-            <w:r>
-              <w:t>Not Applicable</w:t>
-            </w:r>
-          </w:p>
-        </w:tc>
-        <w:tc>
-          <w:tcPr>
-            <w:tcW w:w="4560" w:type="dxa"/>
-          </w:tcPr>
-          <w:p>
-            <w:r>
-              <w:t xml:space="preserve">The product offers no relay or emergency service.</w:t>
-            </w:r>
-          </w:p>
-        </w:tc>
-      </w:tr>
-      <w:tr>
-        <w:trPr>
-          <w:cantSplit/>
-        </w:trPr>
-        <w:tc>
-          <w:tcPr>
-            <w:tcW w:w="3000" w:type="dxa"/>
-          </w:tcPr>
-          <w:p>
-            <w:r>
-              <w:t xml:space="preserve">13.2 Reaching relay services</w:t>
-            </w:r>
-          </w:p>
-        </w:tc>
-        <w:tc>
-          <w:tcPr>
-            <w:tcW w:w="1800" w:type="dxa"/>
-          </w:tcPr>
-          <w:p>
-            <w:r>
-              <w:t>Not Applicable</w:t>
-            </w:r>
-          </w:p>
-        </w:tc>
-        <w:tc>
-          <w:tcPr>
-            <w:tcW w:w="4560" w:type="dxa"/>
-          </w:tcPr>
-          <w:p>
-            <w:r>
-              <w:t xml:space="preserve">The product offers no relay or emergency service.</w:t>
-            </w:r>
-          </w:p>
-        </w:tc>
-      </w:tr>
-      <w:tr>
-        <w:trPr>
-          <w:cantSplit/>
-        </w:trPr>
-        <w:tc>
-          <w:tcPr>
-            <w:tcW w:w="3000" w:type="dxa"/>
-          </w:tcPr>
-          <w:p>
-            <w:r>
-              <w:t xml:space="preserve">13.3 Reaching emergency services</w:t>
-            </w:r>
-          </w:p>
-        </w:tc>
-        <w:tc>
-          <w:tcPr>
-            <w:tcW w:w="1800" w:type="dxa"/>
-          </w:tcPr>
-          <w:p>
-            <w:r>
-              <w:t>Not Applicable</w:t>
-            </w:r>
-          </w:p>
-        </w:tc>
-        <w:tc>
-          <w:tcPr>
-            <w:tcW w:w="4560" w:type="dxa"/>
-          </w:tcPr>
-          <w:p>
-            <w:r>
-              <w:t xml:space="preserve">The product offers no relay or emergency service.</w:t>
+              <w:t xml:space="preserve">The help centre's accessibility page, linked from the product's help menu, lists the accessibility features, says how to use them and how to get help.</w:t>
+            </w:r>
+          </w:p>
+        </w:tc>
+      </w:tr>
+      <w:tr>
+        <w:trPr>
+          <w:cantSplit/>
+        </w:trPr>
+        <w:tc>
+          <w:tcPr>
+            <w:tcW w:w="3000" w:type="dxa"/>
+          </w:tcPr>
+          <w:p>
+            <w:r>
+              <w:t xml:space="preserve">12.4 Programme guides say which access services there are</w:t>
+            </w:r>
+          </w:p>
+        </w:tc>
+        <w:tc>
+          <w:tcPr>
+            <w:tcW w:w="1800" w:type="dxa"/>
+          </w:tcPr>
+          <w:p>
+            <w:r>
+              <w:t>Not Applicable</w:t>
+            </w:r>
+          </w:p>
+        </w:tc>
+        <w:tc>
+          <w:tcPr>
+            <w:tcW w:w="4560" w:type="dxa"/>
+          </w:tcPr>
+          <w:p>
+            <w:r>
+              <w:t xml:space="preserve">The product is not an electronic programme guide.</w:t>
+            </w:r>
+          </w:p>
+        </w:tc>
+      </w:tr>
+      <w:tr>
+        <w:trPr>
+          <w:cantSplit/>
+        </w:trPr>
+        <w:tc>
+          <w:tcPr>
+            <w:tcW w:w="3000" w:type="dxa"/>
+          </w:tcPr>
+          <w:p>
+            <w:r>
+              <w:t xml:space="preserve">12.5 Showing which access services a programme has</w:t>
+            </w:r>
+          </w:p>
+        </w:tc>
+        <w:tc>
+          <w:tcPr>
+            <w:tcW w:w="1800" w:type="dxa"/>
+          </w:tcPr>
+          <w:p>
+            <w:r>
+              <w:t>Not Applicable</w:t>
+            </w:r>
+          </w:p>
+        </w:tc>
+        <w:tc>
+          <w:tcPr>
+            <w:tcW w:w="4560" w:type="dxa"/>
+          </w:tcPr>
+          <w:p>
+            <w:r>
+              <w:t xml:space="preserve">The product shows no electronic programme guide.</w:t>
+            </w:r>
+          </w:p>
+        </w:tc>
+      </w:tr>
+      <w:tr>
+        <w:trPr>
+          <w:cantSplit/>
+        </w:trPr>
+        <w:tc>
+          <w:tcPr>
+            <w:tcW w:w="3000" w:type="dxa"/>
+          </w:tcPr>
+          <w:p>
+            <w:r>
+              <w:t xml:space="preserve">13.1.2.2 Relay services: users keep their own number</w:t>
+            </w:r>
+          </w:p>
+        </w:tc>
+        <w:tc>
+          <w:tcPr>
+            <w:tcW w:w="1800" w:type="dxa"/>
+          </w:tcPr>
+          <w:p>
+            <w:r>
+              <w:t>Not Applicable</w:t>
+            </w:r>
+          </w:p>
+        </w:tc>
+        <w:tc>
+          <w:tcPr>
+            <w:tcW w:w="4560" w:type="dxa"/>
+          </w:tcPr>
+          <w:p>
+            <w:r>
+              <w:t xml:space="preserve">The product offers no relay service and does not invoke one.</w:t>
+            </w:r>
+          </w:p>
+        </w:tc>
+      </w:tr>
+      <w:tr>
+        <w:trPr>
+          <w:cantSplit/>
+        </w:trPr>
+        <w:tc>
+          <w:tcPr>
+            <w:tcW w:w="3000" w:type="dxa"/>
+          </w:tcPr>
+          <w:p>
+            <w:r>
+              <w:t xml:space="preserve">13.1.2.3 Relay services: the caller is still identified</w:t>
+            </w:r>
+          </w:p>
+        </w:tc>
+        <w:tc>
+          <w:tcPr>
+            <w:tcW w:w="1800" w:type="dxa"/>
+          </w:tcPr>
+          <w:p>
+            <w:r>
+              <w:t>Not Applicable</w:t>
+            </w:r>
+          </w:p>
+        </w:tc>
+        <w:tc>
+          <w:tcPr>
+            <w:tcW w:w="4560" w:type="dxa"/>
+          </w:tcPr>
+          <w:p>
+            <w:r>
+              <w:t xml:space="preserve">The product offers no relay service and does not invoke one.</w:t>
+            </w:r>
+          </w:p>
+        </w:tc>
+      </w:tr>
+      <w:tr>
+        <w:trPr>
+          <w:cantSplit/>
+        </w:trPr>
+        <w:tc>
+          <w:tcPr>
+            <w:tcW w:w="3000" w:type="dxa"/>
+          </w:tcPr>
+          <w:p>
+            <w:r>
+              <w:t xml:space="preserve">13.1.2.4 Relay services: choosing relay when calling</w:t>
+            </w:r>
+          </w:p>
+        </w:tc>
+        <w:tc>
+          <w:tcPr>
+            <w:tcW w:w="1800" w:type="dxa"/>
+          </w:tcPr>
+          <w:p>
+            <w:r>
+              <w:t>Not Applicable</w:t>
+            </w:r>
+          </w:p>
+        </w:tc>
+        <w:tc>
+          <w:tcPr>
+            <w:tcW w:w="4560" w:type="dxa"/>
+          </w:tcPr>
+          <w:p>
+            <w:r>
+              <w:t xml:space="preserve">The product offers no relay service and does not invoke one.</w:t>
+            </w:r>
+          </w:p>
+        </w:tc>
+      </w:tr>
+      <w:tr>
+        <w:trPr>
+          <w:cantSplit/>
+        </w:trPr>
+        <w:tc>
+          <w:tcPr>
+            <w:tcW w:w="3000" w:type="dxa"/>
+          </w:tcPr>
+          <w:p>
+            <w:r>
+              <w:t xml:space="preserve">13.1.2.5 Relay services: choosing relay when answering</w:t>
+            </w:r>
+          </w:p>
+        </w:tc>
+        <w:tc>
+          <w:tcPr>
+            <w:tcW w:w="1800" w:type="dxa"/>
+          </w:tcPr>
+          <w:p>
+            <w:r>
+              <w:t>Not Applicable</w:t>
+            </w:r>
+          </w:p>
+        </w:tc>
+        <w:tc>
+          <w:tcPr>
+            <w:tcW w:w="4560" w:type="dxa"/>
+          </w:tcPr>
+          <w:p>
+            <w:r>
+              <w:t xml:space="preserve">The product offers no relay service and does not invoke one.</w:t>
+            </w:r>
+          </w:p>
+        </w:tc>
+      </w:tr>
+      <w:tr>
+        <w:trPr>
+          <w:cantSplit/>
+        </w:trPr>
+        <w:tc>
+          <w:tcPr>
+            <w:tcW w:w="3000" w:type="dxa"/>
+          </w:tcPr>
+          <w:p>
+            <w:r>
+              <w:t xml:space="preserve">13.1.2.6 Relay services: relay in an emergency call</w:t>
+            </w:r>
+          </w:p>
+        </w:tc>
+        <w:tc>
+          <w:tcPr>
+            <w:tcW w:w="1800" w:type="dxa"/>
+          </w:tcPr>
+          <w:p>
+            <w:r>
+              <w:t>Not Applicable</w:t>
+            </w:r>
+          </w:p>
+        </w:tc>
+        <w:tc>
+          <w:tcPr>
+            <w:tcW w:w="4560" w:type="dxa"/>
+          </w:tcPr>
+          <w:p>
+            <w:r>
+              <w:t xml:space="preserve">The product offers no relay service and does not invoke one.</w:t>
+            </w:r>
+          </w:p>
+        </w:tc>
+      </w:tr>
+      <w:tr>
+        <w:trPr>
+          <w:cantSplit/>
+        </w:trPr>
+        <w:tc>
+          <w:tcPr>
+            <w:tcW w:w="3000" w:type="dxa"/>
+          </w:tcPr>
+          <w:p>
+            <w:r>
+              <w:t xml:space="preserve">13.1.3.1 Relay services: converting between modes in a voice call</w:t>
+            </w:r>
+          </w:p>
+        </w:tc>
+        <w:tc>
+          <w:tcPr>
+            <w:tcW w:w="1800" w:type="dxa"/>
+          </w:tcPr>
+          <w:p>
+            <w:r>
+              <w:t>Not Applicable</w:t>
+            </w:r>
+          </w:p>
+        </w:tc>
+        <w:tc>
+          <w:tcPr>
+            <w:tcW w:w="4560" w:type="dxa"/>
+          </w:tcPr>
+          <w:p>
+            <w:r>
+              <w:t xml:space="preserve">The product offers no relay service and does not invoke one.</w:t>
+            </w:r>
+          </w:p>
+        </w:tc>
+      </w:tr>
+      <w:tr>
+        <w:trPr>
+          <w:cantSplit/>
+        </w:trPr>
+        <w:tc>
+          <w:tcPr>
+            <w:tcW w:w="3000" w:type="dxa"/>
+          </w:tcPr>
+          <w:p>
+            <w:r>
+              <w:t xml:space="preserve">13.1.3.2 Relay services: other media passed through</w:t>
+            </w:r>
+          </w:p>
+        </w:tc>
+        <w:tc>
+          <w:tcPr>
+            <w:tcW w:w="1800" w:type="dxa"/>
+          </w:tcPr>
+          <w:p>
+            <w:r>
+              <w:t>Not Applicable</w:t>
+            </w:r>
+          </w:p>
+        </w:tc>
+        <w:tc>
+          <w:tcPr>
+            <w:tcW w:w="4560" w:type="dxa"/>
+          </w:tcPr>
+          <w:p>
+            <w:r>
+              <w:t xml:space="preserve">The product offers no relay service and does not invoke one.</w:t>
+            </w:r>
+          </w:p>
+        </w:tc>
+      </w:tr>
+      <w:tr>
+        <w:trPr>
+          <w:cantSplit/>
+        </w:trPr>
+        <w:tc>
+          <w:tcPr>
+            <w:tcW w:w="3000" w:type="dxa"/>
+          </w:tcPr>
+          <w:p>
+            <w:r>
+              <w:t xml:space="preserve">13.1.3.3 Relay services: taking part in conferences</w:t>
+            </w:r>
+          </w:p>
+        </w:tc>
+        <w:tc>
+          <w:tcPr>
+            <w:tcW w:w="1800" w:type="dxa"/>
+          </w:tcPr>
+          <w:p>
+            <w:r>
+              <w:t>Not Applicable</w:t>
+            </w:r>
+          </w:p>
+        </w:tc>
+        <w:tc>
+          <w:tcPr>
+            <w:tcW w:w="4560" w:type="dxa"/>
+          </w:tcPr>
+          <w:p>
+            <w:r>
+              <w:t xml:space="preserve">The product offers no relay service and does not invoke one.</w:t>
+            </w:r>
+          </w:p>
+        </w:tc>
+      </w:tr>
+      <w:tr>
+        <w:trPr>
+          <w:cantSplit/>
+        </w:trPr>
+        <w:tc>
+          <w:tcPr>
+            <w:tcW w:w="3000" w:type="dxa"/>
+          </w:tcPr>
+          <w:p>
+            <w:r>
+              <w:t xml:space="preserve">13.1.3.4 Relay services: called in by emergency services</w:t>
+            </w:r>
+          </w:p>
+        </w:tc>
+        <w:tc>
+          <w:tcPr>
+            <w:tcW w:w="1800" w:type="dxa"/>
+          </w:tcPr>
+          <w:p>
+            <w:r>
+              <w:t>Not Applicable</w:t>
+            </w:r>
+          </w:p>
+        </w:tc>
+        <w:tc>
+          <w:tcPr>
+            <w:tcW w:w="4560" w:type="dxa"/>
+          </w:tcPr>
+          <w:p>
+            <w:r>
+              <w:t xml:space="preserve">The product offers no relay service and does not invoke one.</w:t>
             </w:r>
           </w:p>
         </w:tc>

</xml_diff>

<commit_message>
fix(metais-v1): [W7-NB4] the ACR carries W3C's notice wherever it copies WCAG's names, its partials cite their sources, and its levels and acr.json's validation are pinned
</commit_message>
<xml_diff>
--- a/examples/accessibility-conformance-report/examples/international/expected/acr.docx
+++ b/examples/accessibility-conformance-report/examples/international/expected/acr.docx
@@ -261,6 +261,11 @@
         <w:t>WCAG 2.2</w:t>
       </w:r>
     </w:p>
+    <w:p>
+      <w:r>
+        <w:t xml:space="preserve">The criterion numbers, names and levels in this table are excerpts of W3C's document, copied as they are: Web Content Accessibility Guidelines (WCAG) 2.2, https://www.w3.org/TR/2024/REC-WCAG22-20241212/, status: W3C Recommendation 12 December 2024. Copyright © 2020-2024 World Wide Web Consortium. W3C® liability, trademark and document use rules apply. W3C has not reviewed or endorsed this report.</w:t>
+      </w:r>
+    </w:p>
     <w:tbl>
       <w:tblPr>
         <w:tblStyle w:val="ReportTable"/>

</xml_diff>

<commit_message>
fix(metais-v1): [W7-NB4] the example packages: W3C's notice on every WCAG copy, cited partials, and pinned ACR levels, acr.json validation and scaffold modes (#184)
</commit_message>
<xml_diff>
--- a/examples/accessibility-conformance-report/examples/international/expected/acr.docx
+++ b/examples/accessibility-conformance-report/examples/international/expected/acr.docx
@@ -261,6 +261,11 @@
         <w:t>WCAG 2.2</w:t>
       </w:r>
     </w:p>
+    <w:p>
+      <w:r>
+        <w:t xml:space="preserve">The criterion numbers, names and levels in this table are excerpts of W3C's document, copied as they are: Web Content Accessibility Guidelines (WCAG) 2.2, https://www.w3.org/TR/2024/REC-WCAG22-20241212/, status: W3C Recommendation 12 December 2024. Copyright © 2020-2024 World Wide Web Consortium. W3C® liability, trademark and document use rules apply. W3C has not reviewed or endorsed this report.</w:t>
+      </w:r>
+    </w:p>
     <w:tbl>
       <w:tblPr>
         <w:tblStyle w:val="ReportTable"/>

</xml_diff>